<commit_message>
TS Kramam 7.2 corrections pushed 27/03
</commit_message>
<xml_diff>
--- a/TS-Kramam/TS-7.2/TS 7.2 Tamil Krama Paatam Corrections.docx
+++ b/TS-Kramam/TS-7.2/TS 7.2 Tamil Krama Paatam Corrections.docx
@@ -51,17 +51,7 @@
           <w:szCs w:val="32"/>
           <w:u w:val="single"/>
         </w:rPr>
-        <w:t xml:space="preserve">7.2 </w:t>
-      </w:r>
-      <w:r>
-        <w:rPr>
-          <w:b/>
-          <w:bCs/>
-          <w:sz w:val="32"/>
-          <w:szCs w:val="32"/>
-          <w:u w:val="single"/>
-        </w:rPr>
-        <w:t xml:space="preserve">Tamil </w:t>
+        <w:t xml:space="preserve">7.2 Tamil </w:t>
       </w:r>
       <w:r>
         <w:rPr>
@@ -150,12 +140,16 @@
               <w:spacing w:before="0" w:line="240" w:lineRule="auto"/>
               <w:jc w:val="center"/>
               <w:rPr>
+                <w:b/>
+                <w:bCs/>
                 <w:sz w:val="32"/>
                 <w:szCs w:val="32"/>
               </w:rPr>
             </w:pPr>
             <w:r>
               <w:rPr>
+                <w:b/>
+                <w:bCs/>
                 <w:sz w:val="32"/>
                 <w:szCs w:val="32"/>
               </w:rPr>
@@ -167,12 +161,16 @@
               <w:spacing w:before="0" w:line="240" w:lineRule="auto"/>
               <w:jc w:val="center"/>
               <w:rPr>
+                <w:b/>
+                <w:bCs/>
                 <w:sz w:val="32"/>
                 <w:szCs w:val="32"/>
               </w:rPr>
             </w:pPr>
             <w:r>
               <w:rPr>
+                <w:b/>
+                <w:bCs/>
                 <w:sz w:val="32"/>
                 <w:szCs w:val="32"/>
               </w:rPr>
@@ -189,12 +187,16 @@
               <w:spacing w:before="0" w:line="240" w:lineRule="auto"/>
               <w:jc w:val="center"/>
               <w:rPr>
+                <w:b/>
+                <w:bCs/>
                 <w:sz w:val="32"/>
                 <w:szCs w:val="32"/>
               </w:rPr>
             </w:pPr>
             <w:r>
               <w:rPr>
+                <w:b/>
+                <w:bCs/>
                 <w:sz w:val="32"/>
                 <w:szCs w:val="32"/>
               </w:rPr>
@@ -212,16 +214,1999 @@
               <w:ind w:right="-18"/>
               <w:jc w:val="center"/>
               <w:rPr>
+                <w:b/>
+                <w:bCs/>
                 <w:sz w:val="32"/>
                 <w:szCs w:val="32"/>
               </w:rPr>
             </w:pPr>
             <w:r>
               <w:rPr>
+                <w:b/>
+                <w:bCs/>
                 <w:sz w:val="32"/>
                 <w:szCs w:val="32"/>
               </w:rPr>
               <w:t>To be read as or corrected as</w:t>
+            </w:r>
+          </w:p>
+        </w:tc>
+      </w:tr>
+      <w:tr>
+        <w:tc>
+          <w:tcPr>
+            <w:tcW w:w="3877" w:type="dxa"/>
+          </w:tcPr>
+          <w:p>
+            <w:pPr>
+              <w:widowControl w:val="0"/>
+              <w:tabs>
+                <w:tab w:val="left" w:pos="993"/>
+              </w:tabs>
+              <w:autoSpaceDE w:val="0"/>
+              <w:autoSpaceDN w:val="0"/>
+              <w:adjustRightInd w:val="0"/>
+              <w:spacing w:before="0" w:line="240" w:lineRule="auto"/>
+              <w:ind w:right="297"/>
+              <w:rPr>
+                <w:rFonts w:cs="Arial"/>
+                <w:b/>
+                <w:sz w:val="28"/>
+                <w:szCs w:val="32"/>
+              </w:rPr>
+            </w:pPr>
+            <w:r>
+              <w:rPr>
+                <w:rFonts w:cs="Arial"/>
+                <w:b/>
+                <w:sz w:val="28"/>
+                <w:szCs w:val="32"/>
+              </w:rPr>
+              <w:t>T.S.</w:t>
+            </w:r>
+            <w:r>
+              <w:rPr>
+                <w:rFonts w:cs="Arial"/>
+                <w:b/>
+                <w:sz w:val="28"/>
+                <w:szCs w:val="32"/>
+              </w:rPr>
+              <w:t>7.2.6.3</w:t>
+            </w:r>
+            <w:r>
+              <w:rPr>
+                <w:rFonts w:cs="Arial"/>
+                <w:b/>
+                <w:sz w:val="28"/>
+                <w:szCs w:val="32"/>
+              </w:rPr>
+              <w:t xml:space="preserve"> – Kramam</w:t>
+            </w:r>
+          </w:p>
+          <w:p>
+            <w:pPr>
+              <w:widowControl w:val="0"/>
+              <w:tabs>
+                <w:tab w:val="left" w:pos="993"/>
+              </w:tabs>
+              <w:autoSpaceDE w:val="0"/>
+              <w:autoSpaceDN w:val="0"/>
+              <w:adjustRightInd w:val="0"/>
+              <w:spacing w:before="0" w:line="240" w:lineRule="auto"/>
+              <w:ind w:right="297"/>
+              <w:rPr>
+                <w:rFonts w:cs="Arial"/>
+                <w:b/>
+                <w:sz w:val="28"/>
+                <w:szCs w:val="32"/>
+              </w:rPr>
+            </w:pPr>
+            <w:r>
+              <w:rPr>
+                <w:rFonts w:cs="Arial"/>
+                <w:b/>
+                <w:sz w:val="28"/>
+                <w:szCs w:val="32"/>
+              </w:rPr>
+              <w:t xml:space="preserve">Krama Vaakyam No.– </w:t>
+            </w:r>
+            <w:r>
+              <w:rPr>
+                <w:rFonts w:cs="Arial"/>
+                <w:b/>
+                <w:sz w:val="28"/>
+                <w:szCs w:val="32"/>
+              </w:rPr>
+              <w:t>37</w:t>
+            </w:r>
+          </w:p>
+          <w:p>
+            <w:pPr>
+              <w:spacing w:before="0" w:line="240" w:lineRule="auto"/>
+              <w:rPr>
+                <w:b/>
+                <w:bCs/>
+                <w:sz w:val="32"/>
+                <w:szCs w:val="32"/>
+              </w:rPr>
+            </w:pPr>
+            <w:r>
+              <w:rPr>
+                <w:rFonts w:cs="Arial"/>
+                <w:b/>
+                <w:sz w:val="28"/>
+                <w:szCs w:val="32"/>
+              </w:rPr>
+              <w:t>Panchaati No</w:t>
+            </w:r>
+            <w:r>
+              <w:rPr>
+                <w:rFonts w:cs="Arial"/>
+                <w:b/>
+                <w:szCs w:val="32"/>
+              </w:rPr>
+              <w:t>. -</w:t>
+            </w:r>
+            <w:r>
+              <w:rPr>
+                <w:rFonts w:cs="Arial"/>
+                <w:b/>
+                <w:sz w:val="28"/>
+                <w:szCs w:val="28"/>
+              </w:rPr>
+              <w:t xml:space="preserve"> 21</w:t>
+            </w:r>
+          </w:p>
+        </w:tc>
+        <w:tc>
+          <w:tcPr>
+            <w:tcW w:w="4848" w:type="dxa"/>
+          </w:tcPr>
+          <w:p>
+            <w:pPr>
+              <w:spacing w:before="0" w:line="240" w:lineRule="auto"/>
+              <w:rPr>
+                <w:b/>
+                <w:bCs/>
+                <w:sz w:val="32"/>
+                <w:szCs w:val="32"/>
+              </w:rPr>
+            </w:pPr>
+            <w:r>
+              <w:rPr>
+                <w:rFonts w:ascii="Latha" w:hAnsi="Latha" w:cs="Latha"/>
+                <w:sz w:val="28"/>
+                <w:szCs w:val="28"/>
+                <w:cs/>
+                <w:lang w:bidi="ta-IN"/>
+              </w:rPr>
+              <w:t>ஏ</w:t>
+            </w:r>
+            <w:r>
+              <w:rPr>
+                <w:rFonts w:ascii="BRH Tamil Tab Extra" w:hAnsi="BRH Tamil Tab Extra" w:cs="Latha"/>
+                <w:b/>
+                <w:sz w:val="32"/>
+                <w:szCs w:val="28"/>
+                <w:lang w:bidi="ta-IN"/>
+              </w:rPr>
+              <w:t>…</w:t>
+            </w:r>
+            <w:r>
+              <w:rPr>
+                <w:rFonts w:ascii="Latha" w:hAnsi="Latha" w:cs="Latha"/>
+                <w:sz w:val="28"/>
+                <w:szCs w:val="28"/>
+                <w:cs/>
+                <w:lang w:bidi="ta-IN"/>
+              </w:rPr>
+              <w:t>கா</w:t>
+            </w:r>
+            <w:r>
+              <w:rPr>
+                <w:rFonts w:ascii="BRH Tamil Tab Extra" w:hAnsi="BRH Tamil Tab Extra" w:cs="Latha"/>
+                <w:b/>
+                <w:sz w:val="32"/>
+                <w:szCs w:val="28"/>
+                <w:lang w:bidi="ta-IN"/>
+              </w:rPr>
+              <w:t>…</w:t>
+            </w:r>
+            <w:r>
+              <w:rPr>
+                <w:rFonts w:ascii="Latha" w:hAnsi="Latha" w:cs="Latha"/>
+                <w:sz w:val="28"/>
+                <w:szCs w:val="28"/>
+                <w:cs/>
+                <w:lang w:bidi="ta-IN"/>
+              </w:rPr>
+              <w:t>த</w:t>
+            </w:r>
+            <w:r>
+              <w:rPr>
+                <w:rFonts w:ascii="BRH Tamil Tab Extra" w:hAnsi="BRH Tamil Tab Extra" w:cs="Latha"/>
+                <w:b/>
+                <w:sz w:val="32"/>
+                <w:szCs w:val="28"/>
+                <w:lang w:bidi="ta-IN"/>
+              </w:rPr>
+              <w:t>…</w:t>
+            </w:r>
+            <w:r>
+              <w:rPr>
+                <w:rFonts w:ascii="Latha" w:hAnsi="Latha" w:cs="Latha"/>
+                <w:b/>
+                <w:bCs/>
+                <w:position w:val="-12"/>
+                <w:sz w:val="28"/>
+                <w:szCs w:val="28"/>
+                <w:cs/>
+                <w:lang w:bidi="ta-IN"/>
+              </w:rPr>
+              <w:t>3</w:t>
+            </w:r>
+            <w:r>
+              <w:rPr>
+                <w:rFonts w:ascii="Latha" w:hAnsi="Latha" w:cs="Latha"/>
+                <w:sz w:val="28"/>
+                <w:szCs w:val="28"/>
+                <w:cs/>
+                <w:lang w:bidi="ta-IN"/>
+              </w:rPr>
+              <w:t>ஶ</w:t>
+            </w:r>
+            <w:r>
+              <w:rPr>
+                <w:rFonts w:ascii="BRH Tamil Tab Extra" w:hAnsi="BRH Tamil Tab Extra" w:cs="Latha"/>
+                <w:b/>
+                <w:sz w:val="32"/>
+                <w:szCs w:val="28"/>
+                <w:lang w:bidi="ta-IN"/>
+              </w:rPr>
+              <w:t>…</w:t>
+            </w:r>
+            <w:r>
+              <w:rPr>
+                <w:rFonts w:ascii="Latha" w:hAnsi="Latha" w:cs="Latha"/>
+                <w:sz w:val="28"/>
+                <w:szCs w:val="28"/>
+                <w:cs/>
+                <w:lang w:bidi="ta-IN"/>
+              </w:rPr>
+              <w:t>ரா</w:t>
+            </w:r>
+            <w:r>
+              <w:rPr>
+                <w:rFonts w:ascii="BRH Tamil Tab Extra" w:hAnsi="BRH Tamil Tab Extra" w:cs="Latha"/>
+                <w:b/>
+                <w:sz w:val="32"/>
+                <w:szCs w:val="28"/>
+                <w:lang w:bidi="ta-IN"/>
+              </w:rPr>
+              <w:t>…</w:t>
+            </w:r>
+            <w:r>
+              <w:rPr>
+                <w:rFonts w:ascii="Latha" w:hAnsi="Latha" w:cs="Latha"/>
+                <w:sz w:val="28"/>
+                <w:szCs w:val="28"/>
+                <w:cs/>
+                <w:lang w:bidi="ta-IN"/>
+              </w:rPr>
+              <w:t>த்ர</w:t>
+            </w:r>
+            <w:r>
+              <w:rPr>
+                <w:rFonts w:ascii="Latha" w:hAnsi="Latha" w:cs="Latha"/>
+                <w:sz w:val="28"/>
+                <w:szCs w:val="28"/>
+                <w:lang w:bidi="ta-IN"/>
+              </w:rPr>
+              <w:t xml:space="preserve"> </w:t>
+            </w:r>
+            <w:r>
+              <w:rPr>
+                <w:rFonts w:ascii="Latha" w:hAnsi="Latha" w:cs="Latha"/>
+                <w:sz w:val="28"/>
+                <w:szCs w:val="28"/>
+                <w:cs/>
+                <w:lang w:bidi="ta-IN"/>
+              </w:rPr>
+              <w:t>இத்யே</w:t>
+            </w:r>
+            <w:r>
+              <w:rPr>
+                <w:rFonts w:ascii="BRH Tamil Tab Extra" w:hAnsi="BRH Tamil Tab Extra" w:cs="Latha"/>
+                <w:b/>
+                <w:sz w:val="36"/>
+                <w:szCs w:val="28"/>
+                <w:lang w:bidi="ta-IN"/>
+              </w:rPr>
+              <w:t>†</w:t>
+            </w:r>
+            <w:r>
+              <w:rPr>
+                <w:rFonts w:ascii="Latha" w:hAnsi="Latha" w:cs="Latha"/>
+                <w:sz w:val="28"/>
+                <w:szCs w:val="28"/>
+                <w:highlight w:val="yellow"/>
+                <w:cs/>
+                <w:lang w:bidi="ta-IN"/>
+              </w:rPr>
+              <w:t>காஶ</w:t>
+            </w:r>
+            <w:r>
+              <w:rPr>
+                <w:rFonts w:ascii="Latha" w:hAnsi="Latha" w:cs="Latha"/>
+                <w:sz w:val="28"/>
+                <w:szCs w:val="28"/>
+                <w:lang w:bidi="ta-IN"/>
+              </w:rPr>
+              <w:t xml:space="preserve"> - </w:t>
+            </w:r>
+            <w:r>
+              <w:rPr>
+                <w:rFonts w:ascii="Latha" w:hAnsi="Latha" w:cs="Latha"/>
+                <w:sz w:val="28"/>
+                <w:szCs w:val="28"/>
+                <w:cs/>
+                <w:lang w:bidi="ta-IN"/>
+              </w:rPr>
+              <w:t>ரா</w:t>
+            </w:r>
+            <w:r>
+              <w:rPr>
+                <w:rFonts w:ascii="BRH Tamil Tab Extra" w:hAnsi="BRH Tamil Tab Extra" w:cs="Latha"/>
+                <w:b/>
+                <w:sz w:val="32"/>
+                <w:szCs w:val="28"/>
+                <w:lang w:bidi="ta-IN"/>
+              </w:rPr>
+              <w:t>…</w:t>
+            </w:r>
+            <w:r>
+              <w:rPr>
+                <w:rFonts w:ascii="Latha" w:hAnsi="Latha" w:cs="Latha"/>
+                <w:sz w:val="28"/>
+                <w:szCs w:val="28"/>
+                <w:cs/>
+                <w:lang w:bidi="ta-IN"/>
+              </w:rPr>
+              <w:t>த்ர</w:t>
+            </w:r>
+            <w:r>
+              <w:rPr>
+                <w:rFonts w:ascii="Latha" w:hAnsi="Latha" w:cs="Latha"/>
+                <w:b/>
+                <w:bCs/>
+                <w:sz w:val="32"/>
+                <w:szCs w:val="32"/>
+                <w:cs/>
+                <w:lang w:bidi="ta-IN"/>
+              </w:rPr>
+              <w:t>:</w:t>
+            </w:r>
+            <w:r>
+              <w:rPr>
+                <w:rFonts w:ascii="Latha" w:hAnsi="Latha" w:cs="Latha"/>
+                <w:sz w:val="28"/>
+                <w:szCs w:val="28"/>
+                <w:lang w:bidi="ta-IN"/>
+              </w:rPr>
+              <w:t xml:space="preserve"> |</w:t>
+            </w:r>
+          </w:p>
+        </w:tc>
+        <w:tc>
+          <w:tcPr>
+            <w:tcW w:w="5220" w:type="dxa"/>
+          </w:tcPr>
+          <w:p>
+            <w:pPr>
+              <w:spacing w:before="0" w:line="240" w:lineRule="auto"/>
+              <w:ind w:right="-18"/>
+              <w:rPr>
+                <w:b/>
+                <w:bCs/>
+                <w:sz w:val="32"/>
+                <w:szCs w:val="32"/>
+              </w:rPr>
+            </w:pPr>
+            <w:r>
+              <w:rPr>
+                <w:rFonts w:ascii="Latha" w:hAnsi="Latha" w:cs="Latha"/>
+                <w:sz w:val="28"/>
+                <w:szCs w:val="28"/>
+                <w:cs/>
+                <w:lang w:bidi="ta-IN"/>
+              </w:rPr>
+              <w:t>ஏ</w:t>
+            </w:r>
+            <w:r>
+              <w:rPr>
+                <w:rFonts w:ascii="BRH Tamil Tab Extra" w:hAnsi="BRH Tamil Tab Extra" w:cs="Latha"/>
+                <w:b/>
+                <w:sz w:val="32"/>
+                <w:szCs w:val="28"/>
+                <w:lang w:bidi="ta-IN"/>
+              </w:rPr>
+              <w:t>…</w:t>
+            </w:r>
+            <w:r>
+              <w:rPr>
+                <w:rFonts w:ascii="Latha" w:hAnsi="Latha" w:cs="Latha"/>
+                <w:sz w:val="28"/>
+                <w:szCs w:val="28"/>
+                <w:cs/>
+                <w:lang w:bidi="ta-IN"/>
+              </w:rPr>
+              <w:t>கா</w:t>
+            </w:r>
+            <w:r>
+              <w:rPr>
+                <w:rFonts w:ascii="BRH Tamil Tab Extra" w:hAnsi="BRH Tamil Tab Extra" w:cs="Latha"/>
+                <w:b/>
+                <w:sz w:val="32"/>
+                <w:szCs w:val="28"/>
+                <w:lang w:bidi="ta-IN"/>
+              </w:rPr>
+              <w:t>…</w:t>
+            </w:r>
+            <w:r>
+              <w:rPr>
+                <w:rFonts w:ascii="Latha" w:hAnsi="Latha" w:cs="Latha"/>
+                <w:sz w:val="28"/>
+                <w:szCs w:val="28"/>
+                <w:cs/>
+                <w:lang w:bidi="ta-IN"/>
+              </w:rPr>
+              <w:t>த</w:t>
+            </w:r>
+            <w:r>
+              <w:rPr>
+                <w:rFonts w:ascii="BRH Tamil Tab Extra" w:hAnsi="BRH Tamil Tab Extra" w:cs="Latha"/>
+                <w:b/>
+                <w:sz w:val="32"/>
+                <w:szCs w:val="28"/>
+                <w:lang w:bidi="ta-IN"/>
+              </w:rPr>
+              <w:t>…</w:t>
+            </w:r>
+            <w:r>
+              <w:rPr>
+                <w:rFonts w:ascii="Latha" w:hAnsi="Latha" w:cs="Latha"/>
+                <w:b/>
+                <w:bCs/>
+                <w:position w:val="-12"/>
+                <w:sz w:val="28"/>
+                <w:szCs w:val="28"/>
+                <w:cs/>
+                <w:lang w:bidi="ta-IN"/>
+              </w:rPr>
+              <w:t>3</w:t>
+            </w:r>
+            <w:r>
+              <w:rPr>
+                <w:rFonts w:ascii="Latha" w:hAnsi="Latha" w:cs="Latha"/>
+                <w:sz w:val="28"/>
+                <w:szCs w:val="28"/>
+                <w:cs/>
+                <w:lang w:bidi="ta-IN"/>
+              </w:rPr>
+              <w:t>ஶ</w:t>
+            </w:r>
+            <w:r>
+              <w:rPr>
+                <w:rFonts w:ascii="BRH Tamil Tab Extra" w:hAnsi="BRH Tamil Tab Extra" w:cs="Latha"/>
+                <w:b/>
+                <w:sz w:val="32"/>
+                <w:szCs w:val="28"/>
+                <w:lang w:bidi="ta-IN"/>
+              </w:rPr>
+              <w:t>…</w:t>
+            </w:r>
+            <w:r>
+              <w:rPr>
+                <w:rFonts w:ascii="Latha" w:hAnsi="Latha" w:cs="Latha"/>
+                <w:sz w:val="28"/>
+                <w:szCs w:val="28"/>
+                <w:cs/>
+                <w:lang w:bidi="ta-IN"/>
+              </w:rPr>
+              <w:t>ரா</w:t>
+            </w:r>
+            <w:r>
+              <w:rPr>
+                <w:rFonts w:ascii="BRH Tamil Tab Extra" w:hAnsi="BRH Tamil Tab Extra" w:cs="Latha"/>
+                <w:b/>
+                <w:sz w:val="32"/>
+                <w:szCs w:val="28"/>
+                <w:lang w:bidi="ta-IN"/>
+              </w:rPr>
+              <w:t>…</w:t>
+            </w:r>
+            <w:r>
+              <w:rPr>
+                <w:rFonts w:ascii="Latha" w:hAnsi="Latha" w:cs="Latha"/>
+                <w:sz w:val="28"/>
+                <w:szCs w:val="28"/>
+                <w:cs/>
+                <w:lang w:bidi="ta-IN"/>
+              </w:rPr>
+              <w:t>த்ர</w:t>
+            </w:r>
+            <w:r>
+              <w:rPr>
+                <w:rFonts w:ascii="Latha" w:hAnsi="Latha" w:cs="Latha"/>
+                <w:sz w:val="28"/>
+                <w:szCs w:val="28"/>
+                <w:lang w:bidi="ta-IN"/>
+              </w:rPr>
+              <w:t xml:space="preserve"> </w:t>
+            </w:r>
+            <w:r>
+              <w:rPr>
+                <w:rFonts w:ascii="Latha" w:hAnsi="Latha" w:cs="Latha"/>
+                <w:sz w:val="28"/>
+                <w:szCs w:val="28"/>
+                <w:cs/>
+                <w:lang w:bidi="ta-IN"/>
+              </w:rPr>
+              <w:t>இத்யே</w:t>
+            </w:r>
+            <w:r>
+              <w:rPr>
+                <w:rFonts w:ascii="BRH Tamil Tab Extra" w:hAnsi="BRH Tamil Tab Extra" w:cs="Latha"/>
+                <w:b/>
+                <w:sz w:val="36"/>
+                <w:szCs w:val="28"/>
+                <w:lang w:bidi="ta-IN"/>
+              </w:rPr>
+              <w:t>†</w:t>
+            </w:r>
+            <w:r>
+              <w:rPr>
+                <w:rFonts w:ascii="Latha" w:hAnsi="Latha" w:cs="Latha"/>
+                <w:sz w:val="28"/>
+                <w:szCs w:val="28"/>
+                <w:highlight w:val="green"/>
+                <w:cs/>
+                <w:lang w:bidi="ta-IN"/>
+              </w:rPr>
+              <w:t>காத</w:t>
+            </w:r>
+            <w:r>
+              <w:rPr>
+                <w:rFonts w:ascii="Latha" w:hAnsi="Latha" w:cs="Latha"/>
+                <w:b/>
+                <w:bCs/>
+                <w:position w:val="-12"/>
+                <w:sz w:val="28"/>
+                <w:szCs w:val="28"/>
+                <w:highlight w:val="green"/>
+                <w:cs/>
+                <w:lang w:bidi="ta-IN"/>
+              </w:rPr>
+              <w:t>3</w:t>
+            </w:r>
+            <w:r>
+              <w:rPr>
+                <w:rFonts w:ascii="Latha" w:hAnsi="Latha" w:cs="Latha"/>
+                <w:sz w:val="28"/>
+                <w:szCs w:val="28"/>
+                <w:highlight w:val="green"/>
+                <w:cs/>
+                <w:lang w:bidi="ta-IN"/>
+              </w:rPr>
+              <w:t>ஶ</w:t>
+            </w:r>
+            <w:r>
+              <w:rPr>
+                <w:rFonts w:ascii="Latha" w:hAnsi="Latha" w:cs="Latha"/>
+                <w:sz w:val="28"/>
+                <w:szCs w:val="28"/>
+                <w:lang w:bidi="ta-IN"/>
+              </w:rPr>
+              <w:t xml:space="preserve"> - </w:t>
+            </w:r>
+            <w:r>
+              <w:rPr>
+                <w:rFonts w:ascii="Latha" w:hAnsi="Latha" w:cs="Latha"/>
+                <w:sz w:val="28"/>
+                <w:szCs w:val="28"/>
+                <w:cs/>
+                <w:lang w:bidi="ta-IN"/>
+              </w:rPr>
+              <w:t>ரா</w:t>
+            </w:r>
+            <w:r>
+              <w:rPr>
+                <w:rFonts w:ascii="BRH Tamil Tab Extra" w:hAnsi="BRH Tamil Tab Extra" w:cs="Latha"/>
+                <w:b/>
+                <w:sz w:val="32"/>
+                <w:szCs w:val="28"/>
+                <w:lang w:bidi="ta-IN"/>
+              </w:rPr>
+              <w:t>…</w:t>
+            </w:r>
+            <w:r>
+              <w:rPr>
+                <w:rFonts w:ascii="Latha" w:hAnsi="Latha" w:cs="Latha"/>
+                <w:sz w:val="28"/>
+                <w:szCs w:val="28"/>
+                <w:cs/>
+                <w:lang w:bidi="ta-IN"/>
+              </w:rPr>
+              <w:t>த்ர</w:t>
+            </w:r>
+            <w:r>
+              <w:rPr>
+                <w:rFonts w:ascii="Latha" w:hAnsi="Latha" w:cs="Latha"/>
+                <w:b/>
+                <w:bCs/>
+                <w:sz w:val="32"/>
+                <w:szCs w:val="32"/>
+                <w:cs/>
+                <w:lang w:bidi="ta-IN"/>
+              </w:rPr>
+              <w:t>:</w:t>
+            </w:r>
+            <w:r>
+              <w:rPr>
+                <w:rFonts w:ascii="Latha" w:hAnsi="Latha" w:cs="Latha"/>
+                <w:sz w:val="28"/>
+                <w:szCs w:val="28"/>
+                <w:lang w:bidi="ta-IN"/>
+              </w:rPr>
+              <w:t xml:space="preserve"> |</w:t>
+            </w:r>
+          </w:p>
+        </w:tc>
+      </w:tr>
+      <w:tr>
+        <w:tc>
+          <w:tcPr>
+            <w:tcW w:w="3877" w:type="dxa"/>
+          </w:tcPr>
+          <w:p>
+            <w:pPr>
+              <w:widowControl w:val="0"/>
+              <w:tabs>
+                <w:tab w:val="left" w:pos="993"/>
+              </w:tabs>
+              <w:autoSpaceDE w:val="0"/>
+              <w:autoSpaceDN w:val="0"/>
+              <w:adjustRightInd w:val="0"/>
+              <w:spacing w:before="0" w:line="240" w:lineRule="auto"/>
+              <w:ind w:right="297"/>
+              <w:rPr>
+                <w:rFonts w:cs="Arial"/>
+                <w:b/>
+                <w:sz w:val="28"/>
+                <w:szCs w:val="32"/>
+              </w:rPr>
+            </w:pPr>
+            <w:r>
+              <w:rPr>
+                <w:rFonts w:cs="Arial"/>
+                <w:b/>
+                <w:sz w:val="28"/>
+                <w:szCs w:val="32"/>
+              </w:rPr>
+              <w:t>T.S.</w:t>
+            </w:r>
+            <w:r>
+              <w:rPr>
+                <w:rFonts w:cs="Arial"/>
+                <w:b/>
+                <w:sz w:val="28"/>
+                <w:szCs w:val="32"/>
+              </w:rPr>
+              <w:t>7.2.7.1</w:t>
+            </w:r>
+            <w:r>
+              <w:rPr>
+                <w:rFonts w:cs="Arial"/>
+                <w:b/>
+                <w:sz w:val="28"/>
+                <w:szCs w:val="32"/>
+              </w:rPr>
+              <w:t xml:space="preserve"> – Kramam</w:t>
+            </w:r>
+          </w:p>
+          <w:p>
+            <w:pPr>
+              <w:widowControl w:val="0"/>
+              <w:tabs>
+                <w:tab w:val="left" w:pos="993"/>
+              </w:tabs>
+              <w:autoSpaceDE w:val="0"/>
+              <w:autoSpaceDN w:val="0"/>
+              <w:adjustRightInd w:val="0"/>
+              <w:spacing w:before="0" w:line="240" w:lineRule="auto"/>
+              <w:ind w:right="297"/>
+              <w:rPr>
+                <w:rFonts w:cs="Arial"/>
+                <w:b/>
+                <w:sz w:val="28"/>
+                <w:szCs w:val="32"/>
+              </w:rPr>
+            </w:pPr>
+            <w:r>
+              <w:rPr>
+                <w:rFonts w:cs="Arial"/>
+                <w:b/>
+                <w:sz w:val="28"/>
+                <w:szCs w:val="32"/>
+              </w:rPr>
+              <w:t xml:space="preserve">Krama Vaakyam No.– </w:t>
+            </w:r>
+            <w:r>
+              <w:rPr>
+                <w:rFonts w:cs="Arial"/>
+                <w:b/>
+                <w:sz w:val="28"/>
+                <w:szCs w:val="32"/>
+              </w:rPr>
+              <w:t>1,2</w:t>
+            </w:r>
+          </w:p>
+          <w:p>
+            <w:pPr>
+              <w:widowControl w:val="0"/>
+              <w:tabs>
+                <w:tab w:val="left" w:pos="993"/>
+              </w:tabs>
+              <w:autoSpaceDE w:val="0"/>
+              <w:autoSpaceDN w:val="0"/>
+              <w:adjustRightInd w:val="0"/>
+              <w:spacing w:before="0" w:line="240" w:lineRule="auto"/>
+              <w:ind w:right="297"/>
+              <w:rPr>
+                <w:rFonts w:cs="Arial"/>
+                <w:b/>
+                <w:sz w:val="28"/>
+                <w:szCs w:val="32"/>
+              </w:rPr>
+            </w:pPr>
+            <w:r>
+              <w:rPr>
+                <w:rFonts w:cs="Arial"/>
+                <w:b/>
+                <w:sz w:val="28"/>
+                <w:szCs w:val="32"/>
+              </w:rPr>
+              <w:t>Panchaati No</w:t>
+            </w:r>
+            <w:r>
+              <w:rPr>
+                <w:rFonts w:cs="Arial"/>
+                <w:b/>
+                <w:szCs w:val="32"/>
+              </w:rPr>
+              <w:t>. -</w:t>
+            </w:r>
+            <w:r>
+              <w:rPr>
+                <w:rFonts w:cs="Arial"/>
+                <w:b/>
+                <w:sz w:val="28"/>
+                <w:szCs w:val="28"/>
+              </w:rPr>
+              <w:t xml:space="preserve"> 2</w:t>
+            </w:r>
+            <w:r>
+              <w:rPr>
+                <w:rFonts w:cs="Arial"/>
+                <w:b/>
+                <w:sz w:val="28"/>
+                <w:szCs w:val="28"/>
+              </w:rPr>
+              <w:t>2</w:t>
+            </w:r>
+          </w:p>
+        </w:tc>
+        <w:tc>
+          <w:tcPr>
+            <w:tcW w:w="4848" w:type="dxa"/>
+          </w:tcPr>
+          <w:p>
+            <w:pPr>
+              <w:spacing w:before="0" w:line="240" w:lineRule="auto"/>
+              <w:rPr>
+                <w:rFonts w:ascii="Latha" w:hAnsi="Latha" w:cs="Latha"/>
+                <w:sz w:val="28"/>
+                <w:szCs w:val="28"/>
+                <w:lang w:bidi="ta-IN"/>
+              </w:rPr>
+            </w:pPr>
+            <w:r>
+              <w:rPr>
+                <w:rFonts w:ascii="Latha" w:hAnsi="Latha" w:cs="Latha"/>
+                <w:sz w:val="28"/>
+                <w:szCs w:val="28"/>
+                <w:highlight w:val="yellow"/>
+                <w:cs/>
+                <w:lang w:bidi="ta-IN"/>
+              </w:rPr>
+              <w:t>ஐ</w:t>
+            </w:r>
+            <w:r>
+              <w:rPr>
+                <w:rFonts w:ascii="BRH Tamil Tab Extra" w:hAnsi="BRH Tamil Tab Extra" w:cs="Latha"/>
+                <w:b/>
+                <w:sz w:val="32"/>
+                <w:szCs w:val="28"/>
+                <w:highlight w:val="yellow"/>
+                <w:lang w:bidi="ta-IN"/>
+              </w:rPr>
+              <w:t>…</w:t>
+            </w:r>
+            <w:r>
+              <w:rPr>
+                <w:rFonts w:ascii="Latha" w:hAnsi="Latha" w:cs="Latha"/>
+                <w:sz w:val="28"/>
+                <w:szCs w:val="28"/>
+                <w:highlight w:val="yellow"/>
+                <w:cs/>
+                <w:lang w:bidi="ta-IN"/>
+              </w:rPr>
+              <w:t>ந்த</w:t>
+            </w:r>
+            <w:r>
+              <w:rPr>
+                <w:rFonts w:ascii="BRH Tamil Tab Extra" w:hAnsi="BRH Tamil Tab Extra" w:cs="Latha"/>
+                <w:b/>
+                <w:sz w:val="32"/>
+                <w:szCs w:val="28"/>
+                <w:highlight w:val="yellow"/>
+                <w:lang w:bidi="ta-IN"/>
+              </w:rPr>
+              <w:t>…</w:t>
+            </w:r>
+            <w:r>
+              <w:rPr>
+                <w:rFonts w:ascii="Latha" w:hAnsi="Latha" w:cs="Latha"/>
+                <w:b/>
+                <w:bCs/>
+                <w:position w:val="-12"/>
+                <w:sz w:val="28"/>
+                <w:szCs w:val="28"/>
+                <w:cs/>
+                <w:lang w:bidi="ta-IN"/>
+              </w:rPr>
+              <w:t>3</w:t>
+            </w:r>
+            <w:r>
+              <w:rPr>
+                <w:rFonts w:ascii="Latha" w:hAnsi="Latha" w:cs="Latha"/>
+                <w:sz w:val="28"/>
+                <w:szCs w:val="28"/>
+                <w:cs/>
+                <w:lang w:bidi="ta-IN"/>
+              </w:rPr>
+              <w:t>வா</w:t>
+            </w:r>
+            <w:r>
+              <w:rPr>
+                <w:rFonts w:ascii="BRH Tamil Tab Extra" w:hAnsi="BRH Tamil Tab Extra" w:cs="Latha"/>
+                <w:b/>
+                <w:sz w:val="32"/>
+                <w:szCs w:val="28"/>
+                <w:lang w:bidi="ta-IN"/>
+              </w:rPr>
+              <w:t>…</w:t>
+            </w:r>
+            <w:r>
+              <w:rPr>
+                <w:rFonts w:ascii="Latha" w:hAnsi="Latha" w:cs="Latha"/>
+                <w:sz w:val="28"/>
+                <w:szCs w:val="28"/>
+                <w:cs/>
+                <w:lang w:bidi="ta-IN"/>
+              </w:rPr>
+              <w:t>ய</w:t>
+            </w:r>
+            <w:r>
+              <w:rPr>
+                <w:rFonts w:ascii="BRH Tamil Tab Extra" w:hAnsi="BRH Tamil Tab Extra" w:cs="Latha"/>
+                <w:b/>
+                <w:sz w:val="32"/>
+                <w:szCs w:val="28"/>
+                <w:lang w:bidi="ta-IN"/>
+              </w:rPr>
+              <w:t>…</w:t>
+            </w:r>
+            <w:r>
+              <w:rPr>
+                <w:rFonts w:ascii="Latha" w:hAnsi="Latha" w:cs="Latha"/>
+                <w:sz w:val="28"/>
+                <w:szCs w:val="28"/>
+                <w:cs/>
+                <w:lang w:bidi="ta-IN"/>
+              </w:rPr>
+              <w:t>வாக்</w:t>
+            </w:r>
+            <w:r>
+              <w:rPr>
+                <w:rFonts w:ascii="Latha" w:hAnsi="Latha" w:cs="Latha"/>
+                <w:b/>
+                <w:bCs/>
+                <w:position w:val="-12"/>
+                <w:sz w:val="28"/>
+                <w:szCs w:val="28"/>
+                <w:cs/>
+                <w:lang w:bidi="ta-IN"/>
+              </w:rPr>
+              <w:t>3</w:t>
+            </w:r>
+            <w:r>
+              <w:rPr>
+                <w:rFonts w:ascii="Latha" w:hAnsi="Latha" w:cs="Latha"/>
+                <w:sz w:val="28"/>
+                <w:szCs w:val="28"/>
+                <w:cs/>
+                <w:lang w:bidi="ta-IN"/>
+              </w:rPr>
+              <w:t>ரா</w:t>
+            </w:r>
+            <w:r>
+              <w:rPr>
+                <w:rFonts w:ascii="BRH Tamil Tab Extra" w:hAnsi="BRH Tamil Tab Extra" w:cs="Latha"/>
+                <w:b/>
+                <w:sz w:val="36"/>
+                <w:szCs w:val="28"/>
+                <w:lang w:bidi="ta-IN"/>
+              </w:rPr>
+              <w:t>‡</w:t>
+            </w:r>
+            <w:r>
+              <w:rPr>
+                <w:rFonts w:ascii="Latha" w:hAnsi="Latha" w:cs="Latha"/>
+                <w:sz w:val="28"/>
+                <w:szCs w:val="28"/>
+                <w:cs/>
+                <w:lang w:bidi="ta-IN"/>
+              </w:rPr>
+              <w:t>ன்</w:t>
+            </w:r>
+            <w:r>
+              <w:rPr>
+                <w:rFonts w:ascii="Latha" w:hAnsi="Latha" w:cs="Latha"/>
+                <w:sz w:val="28"/>
+                <w:szCs w:val="28"/>
+                <w:lang w:bidi="ta-IN"/>
+              </w:rPr>
+              <w:t xml:space="preserve"> </w:t>
+            </w:r>
+            <w:r>
+              <w:rPr>
+                <w:rFonts w:ascii="Latha" w:hAnsi="Latha" w:cs="Latha"/>
+                <w:sz w:val="28"/>
+                <w:szCs w:val="28"/>
+                <w:cs/>
+                <w:lang w:bidi="ta-IN"/>
+              </w:rPr>
+              <w:t>க்</w:t>
+            </w:r>
+            <w:r>
+              <w:rPr>
+                <w:rFonts w:ascii="Latha" w:hAnsi="Latha" w:cs="Latha"/>
+                <w:b/>
+                <w:bCs/>
+                <w:position w:val="-12"/>
+                <w:sz w:val="28"/>
+                <w:szCs w:val="28"/>
+                <w:cs/>
+                <w:lang w:bidi="ta-IN"/>
+              </w:rPr>
+              <w:t>3</w:t>
+            </w:r>
+            <w:r>
+              <w:rPr>
+                <w:rFonts w:ascii="Latha" w:hAnsi="Latha" w:cs="Latha"/>
+                <w:b/>
+                <w:bCs/>
+                <w:i/>
+                <w:iCs/>
+                <w:sz w:val="28"/>
+                <w:szCs w:val="28"/>
+                <w:cs/>
+                <w:lang w:bidi="ta-IN"/>
+              </w:rPr>
+              <w:t>ரு</w:t>
+            </w:r>
+            <w:r>
+              <w:rPr>
+                <w:rFonts w:ascii="Latha" w:hAnsi="Latha" w:cs="Latha"/>
+                <w:sz w:val="28"/>
+                <w:szCs w:val="28"/>
+                <w:cs/>
+                <w:lang w:bidi="ta-IN"/>
+              </w:rPr>
+              <w:t>ஹ்ணீயாத்</w:t>
+            </w:r>
+            <w:r>
+              <w:rPr>
+                <w:rFonts w:ascii="Latha" w:hAnsi="Latha" w:cs="Latha"/>
+                <w:sz w:val="28"/>
+                <w:szCs w:val="28"/>
+                <w:lang w:bidi="ta-IN"/>
+              </w:rPr>
+              <w:t xml:space="preserve"> |</w:t>
+            </w:r>
+          </w:p>
+          <w:p>
+            <w:pPr>
+              <w:spacing w:before="0" w:line="240" w:lineRule="auto"/>
+              <w:rPr>
+                <w:rFonts w:ascii="Latha" w:hAnsi="Latha" w:cs="Latha"/>
+                <w:sz w:val="28"/>
+                <w:szCs w:val="28"/>
+                <w:lang w:bidi="ta-IN"/>
+              </w:rPr>
+            </w:pPr>
+            <w:r>
+              <w:rPr>
+                <w:rFonts w:ascii="Latha" w:hAnsi="Latha" w:cs="Latha"/>
+                <w:sz w:val="28"/>
+                <w:szCs w:val="28"/>
+                <w:cs/>
+                <w:lang w:bidi="ta-IN"/>
+              </w:rPr>
+              <w:t>ஐ</w:t>
+            </w:r>
+            <w:r>
+              <w:rPr>
+                <w:rFonts w:ascii="BRH Tamil Tab Extra" w:hAnsi="BRH Tamil Tab Extra" w:cs="Latha"/>
+                <w:b/>
+                <w:sz w:val="32"/>
+                <w:szCs w:val="28"/>
+                <w:lang w:bidi="ta-IN"/>
+              </w:rPr>
+              <w:t>…</w:t>
+            </w:r>
+            <w:r>
+              <w:rPr>
+                <w:rFonts w:ascii="Latha" w:hAnsi="Latha" w:cs="Latha"/>
+                <w:sz w:val="28"/>
+                <w:szCs w:val="28"/>
+                <w:cs/>
+                <w:lang w:bidi="ta-IN"/>
+              </w:rPr>
+              <w:t>ந்</w:t>
+            </w:r>
+            <w:r>
+              <w:rPr>
+                <w:rFonts w:ascii="Latha" w:hAnsi="Latha" w:cs="Latha"/>
+                <w:sz w:val="28"/>
+                <w:szCs w:val="28"/>
+                <w:highlight w:val="yellow"/>
+                <w:cs/>
+                <w:lang w:bidi="ta-IN"/>
+              </w:rPr>
+              <w:t>த</w:t>
+            </w:r>
+            <w:r>
+              <w:rPr>
+                <w:rFonts w:ascii="BRH Tamil Tab Extra" w:hAnsi="BRH Tamil Tab Extra" w:cs="Latha"/>
+                <w:b/>
+                <w:sz w:val="32"/>
+                <w:szCs w:val="28"/>
+                <w:highlight w:val="yellow"/>
+                <w:lang w:bidi="ta-IN"/>
+              </w:rPr>
+              <w:t>…</w:t>
+            </w:r>
+            <w:r>
+              <w:rPr>
+                <w:rFonts w:ascii="Latha" w:hAnsi="Latha" w:cs="Latha"/>
+                <w:b/>
+                <w:bCs/>
+                <w:position w:val="-12"/>
+                <w:sz w:val="28"/>
+                <w:szCs w:val="28"/>
+                <w:highlight w:val="yellow"/>
+                <w:cs/>
+                <w:lang w:bidi="ta-IN"/>
+              </w:rPr>
+              <w:t>3</w:t>
+            </w:r>
+            <w:r>
+              <w:rPr>
+                <w:rFonts w:ascii="Latha" w:hAnsi="Latha" w:cs="Latha"/>
+                <w:sz w:val="28"/>
+                <w:szCs w:val="28"/>
+                <w:cs/>
+                <w:lang w:bidi="ta-IN"/>
+              </w:rPr>
+              <w:t>வா</w:t>
+            </w:r>
+            <w:r>
+              <w:rPr>
+                <w:rFonts w:ascii="BRH Tamil Tab Extra" w:hAnsi="BRH Tamil Tab Extra" w:cs="Latha"/>
+                <w:b/>
+                <w:sz w:val="32"/>
+                <w:szCs w:val="28"/>
+                <w:lang w:bidi="ta-IN"/>
+              </w:rPr>
+              <w:t>…</w:t>
+            </w:r>
+            <w:r>
+              <w:rPr>
+                <w:rFonts w:ascii="Latha" w:hAnsi="Latha" w:cs="Latha"/>
+                <w:sz w:val="28"/>
+                <w:szCs w:val="28"/>
+                <w:cs/>
+                <w:lang w:bidi="ta-IN"/>
+              </w:rPr>
+              <w:t>ய</w:t>
+            </w:r>
+            <w:r>
+              <w:rPr>
+                <w:rFonts w:ascii="BRH Tamil Tab Extra" w:hAnsi="BRH Tamil Tab Extra" w:cs="Latha"/>
+                <w:b/>
+                <w:sz w:val="32"/>
+                <w:szCs w:val="28"/>
+                <w:lang w:bidi="ta-IN"/>
+              </w:rPr>
+              <w:t>…</w:t>
+            </w:r>
+            <w:r>
+              <w:rPr>
+                <w:rFonts w:ascii="Latha" w:hAnsi="Latha" w:cs="Latha"/>
+                <w:sz w:val="28"/>
+                <w:szCs w:val="28"/>
+                <w:cs/>
+                <w:lang w:bidi="ta-IN"/>
+              </w:rPr>
+              <w:t>வாக்</w:t>
+            </w:r>
+            <w:r>
+              <w:rPr>
+                <w:rFonts w:ascii="Latha" w:hAnsi="Latha" w:cs="Latha"/>
+                <w:b/>
+                <w:bCs/>
+                <w:position w:val="-12"/>
+                <w:sz w:val="28"/>
+                <w:szCs w:val="28"/>
+                <w:cs/>
+                <w:lang w:bidi="ta-IN"/>
+              </w:rPr>
+              <w:t>3</w:t>
+            </w:r>
+            <w:r>
+              <w:rPr>
+                <w:rFonts w:ascii="Latha" w:hAnsi="Latha" w:cs="Latha"/>
+                <w:sz w:val="28"/>
+                <w:szCs w:val="28"/>
+                <w:cs/>
+                <w:lang w:bidi="ta-IN"/>
+              </w:rPr>
+              <w:t>ரா</w:t>
+            </w:r>
+            <w:r>
+              <w:rPr>
+                <w:rFonts w:ascii="BRH Tamil Tab Extra" w:hAnsi="BRH Tamil Tab Extra" w:cs="Latha"/>
+                <w:b/>
+                <w:sz w:val="32"/>
+                <w:szCs w:val="28"/>
+                <w:lang w:bidi="ta-IN"/>
+              </w:rPr>
+              <w:t>…</w:t>
+            </w:r>
+            <w:r>
+              <w:rPr>
+                <w:rFonts w:ascii="Latha" w:hAnsi="Latha" w:cs="Latha"/>
+                <w:sz w:val="28"/>
+                <w:szCs w:val="28"/>
+                <w:cs/>
+                <w:lang w:bidi="ta-IN"/>
+              </w:rPr>
+              <w:t>னி</w:t>
+            </w:r>
+            <w:r>
+              <w:rPr>
+                <w:rFonts w:ascii="Latha" w:hAnsi="Latha" w:cs="Latha"/>
+                <w:sz w:val="28"/>
+                <w:szCs w:val="28"/>
+                <w:lang w:bidi="ta-IN"/>
+              </w:rPr>
+              <w:t xml:space="preserve">- </w:t>
+            </w:r>
+            <w:r>
+              <w:rPr>
+                <w:rFonts w:ascii="Latha" w:hAnsi="Latha" w:cs="Latha"/>
+                <w:sz w:val="28"/>
+                <w:szCs w:val="28"/>
+                <w:cs/>
+                <w:lang w:bidi="ta-IN"/>
+              </w:rPr>
+              <w:t>த்யை</w:t>
+            </w:r>
+            <w:r>
+              <w:rPr>
+                <w:rFonts w:ascii="BRH Tamil Tab Extra" w:hAnsi="BRH Tamil Tab Extra" w:cs="Latha"/>
+                <w:b/>
+                <w:sz w:val="36"/>
+                <w:szCs w:val="28"/>
+                <w:lang w:bidi="ta-IN"/>
+              </w:rPr>
+              <w:t>‡</w:t>
+            </w:r>
+            <w:r>
+              <w:rPr>
+                <w:rFonts w:ascii="Latha" w:hAnsi="Latha" w:cs="Latha"/>
+                <w:sz w:val="28"/>
+                <w:szCs w:val="28"/>
+                <w:cs/>
+                <w:lang w:bidi="ta-IN"/>
+              </w:rPr>
+              <w:t>ந்த்</w:t>
+            </w:r>
+            <w:r>
+              <w:rPr>
+                <w:rFonts w:ascii="Latha" w:hAnsi="Latha" w:cs="Latha"/>
+                <w:b/>
+                <w:bCs/>
+                <w:position w:val="-12"/>
+                <w:sz w:val="28"/>
+                <w:szCs w:val="28"/>
+                <w:cs/>
+                <w:lang w:bidi="ta-IN"/>
+              </w:rPr>
+              <w:t>3</w:t>
+            </w:r>
+            <w:r>
+              <w:rPr>
+                <w:rFonts w:ascii="Latha" w:hAnsi="Latha" w:cs="Latha"/>
+                <w:sz w:val="28"/>
+                <w:szCs w:val="28"/>
+                <w:cs/>
+                <w:lang w:bidi="ta-IN"/>
+              </w:rPr>
+              <w:t>ரவாய</w:t>
+            </w:r>
+            <w:r>
+              <w:rPr>
+                <w:rFonts w:ascii="BRH Tamil Tab Extra" w:hAnsi="BRH Tamil Tab Extra" w:cs="Latha"/>
+                <w:b/>
+                <w:sz w:val="32"/>
+                <w:szCs w:val="28"/>
+                <w:lang w:bidi="ta-IN"/>
+              </w:rPr>
+              <w:t>…</w:t>
+            </w:r>
+            <w:r>
+              <w:rPr>
+                <w:rFonts w:ascii="Latha" w:hAnsi="Latha" w:cs="Latha"/>
+                <w:sz w:val="28"/>
+                <w:szCs w:val="28"/>
+                <w:cs/>
+                <w:lang w:bidi="ta-IN"/>
+              </w:rPr>
+              <w:t>வ</w:t>
+            </w:r>
+            <w:r>
+              <w:rPr>
+                <w:rFonts w:ascii="Latha" w:hAnsi="Latha" w:cs="Latha"/>
+                <w:sz w:val="28"/>
+                <w:szCs w:val="28"/>
+                <w:lang w:bidi="ta-IN"/>
+              </w:rPr>
+              <w:t xml:space="preserve"> - </w:t>
+            </w:r>
+            <w:r>
+              <w:rPr>
+                <w:rFonts w:ascii="Latha" w:hAnsi="Latha" w:cs="Latha"/>
+                <w:sz w:val="28"/>
+                <w:szCs w:val="28"/>
+                <w:cs/>
+                <w:lang w:bidi="ta-IN"/>
+              </w:rPr>
+              <w:t>அ</w:t>
+            </w:r>
+            <w:r>
+              <w:rPr>
+                <w:rFonts w:ascii="BRH Tamil Tab Extra" w:hAnsi="BRH Tamil Tab Extra" w:cs="Latha"/>
+                <w:b/>
+                <w:sz w:val="32"/>
+                <w:szCs w:val="28"/>
+                <w:lang w:bidi="ta-IN"/>
+              </w:rPr>
+              <w:t>…</w:t>
+            </w:r>
+            <w:r>
+              <w:rPr>
+                <w:rFonts w:ascii="Latha" w:hAnsi="Latha" w:cs="Latha"/>
+                <w:sz w:val="28"/>
+                <w:szCs w:val="28"/>
+                <w:cs/>
+                <w:lang w:bidi="ta-IN"/>
+              </w:rPr>
+              <w:t>க்</w:t>
+            </w:r>
+            <w:r>
+              <w:rPr>
+                <w:rFonts w:ascii="Latha" w:hAnsi="Latha" w:cs="Latha"/>
+                <w:b/>
+                <w:bCs/>
+                <w:position w:val="-12"/>
+                <w:sz w:val="28"/>
+                <w:szCs w:val="28"/>
+                <w:cs/>
+                <w:lang w:bidi="ta-IN"/>
+              </w:rPr>
+              <w:t>3</w:t>
+            </w:r>
+            <w:r>
+              <w:rPr>
+                <w:rFonts w:ascii="Latha" w:hAnsi="Latha" w:cs="Latha"/>
+                <w:sz w:val="28"/>
+                <w:szCs w:val="28"/>
+                <w:cs/>
+                <w:lang w:bidi="ta-IN"/>
+              </w:rPr>
+              <w:t>ரா</w:t>
+            </w:r>
+            <w:r>
+              <w:rPr>
+                <w:rFonts w:ascii="BRH Tamil Tab Extra" w:hAnsi="BRH Tamil Tab Extra" w:cs="Latha"/>
+                <w:b/>
+                <w:sz w:val="32"/>
+                <w:szCs w:val="28"/>
+                <w:lang w:bidi="ta-IN"/>
+              </w:rPr>
+              <w:t>…</w:t>
+            </w:r>
+            <w:r>
+              <w:rPr>
+                <w:rFonts w:ascii="Latha" w:hAnsi="Latha" w:cs="Latha"/>
+                <w:sz w:val="28"/>
+                <w:szCs w:val="28"/>
+                <w:cs/>
+                <w:lang w:bidi="ta-IN"/>
+              </w:rPr>
+              <w:t>ன்</w:t>
+            </w:r>
+            <w:r>
+              <w:rPr>
+                <w:rFonts w:ascii="BRH Tamil Tab Extra" w:hAnsi="BRH Tamil Tab Extra" w:cs="Latha"/>
+                <w:b/>
+                <w:sz w:val="32"/>
+                <w:szCs w:val="28"/>
+                <w:lang w:bidi="ta-IN"/>
+              </w:rPr>
+              <w:t>…</w:t>
+            </w:r>
+            <w:r>
+              <w:rPr>
+                <w:rFonts w:ascii="Latha" w:hAnsi="Latha" w:cs="Latha"/>
+                <w:sz w:val="28"/>
+                <w:szCs w:val="28"/>
+                <w:lang w:bidi="ta-IN"/>
+              </w:rPr>
+              <w:t xml:space="preserve"> </w:t>
+            </w:r>
+          </w:p>
+          <w:p>
+            <w:pPr>
+              <w:spacing w:before="0" w:line="240" w:lineRule="auto"/>
+              <w:rPr>
+                <w:rFonts w:ascii="Latha" w:hAnsi="Latha" w:cs="Latha"/>
+                <w:sz w:val="28"/>
+                <w:szCs w:val="28"/>
+                <w:cs/>
+                <w:lang w:bidi="ta-IN"/>
+              </w:rPr>
+            </w:pPr>
+          </w:p>
+        </w:tc>
+        <w:tc>
+          <w:tcPr>
+            <w:tcW w:w="5220" w:type="dxa"/>
+          </w:tcPr>
+          <w:p>
+            <w:pPr>
+              <w:spacing w:before="0" w:line="240" w:lineRule="auto"/>
+              <w:rPr>
+                <w:rFonts w:ascii="Latha" w:hAnsi="Latha" w:cs="Latha"/>
+                <w:sz w:val="28"/>
+                <w:szCs w:val="28"/>
+                <w:lang w:bidi="ta-IN"/>
+              </w:rPr>
+            </w:pPr>
+            <w:r>
+              <w:rPr>
+                <w:rFonts w:ascii="Latha" w:hAnsi="Latha" w:cs="Latha"/>
+                <w:sz w:val="28"/>
+                <w:szCs w:val="28"/>
+                <w:cs/>
+                <w:lang w:bidi="ta-IN"/>
+              </w:rPr>
+              <w:t>ஐ</w:t>
+            </w:r>
+            <w:r>
+              <w:rPr>
+                <w:rFonts w:ascii="BRH Tamil Tab Extra" w:hAnsi="BRH Tamil Tab Extra" w:cs="Latha"/>
+                <w:b/>
+                <w:sz w:val="32"/>
+                <w:szCs w:val="28"/>
+                <w:lang w:bidi="ta-IN"/>
+              </w:rPr>
+              <w:t>…</w:t>
+            </w:r>
+            <w:r>
+              <w:rPr>
+                <w:rFonts w:ascii="Latha" w:hAnsi="Latha" w:cs="Latha"/>
+                <w:sz w:val="28"/>
+                <w:szCs w:val="28"/>
+                <w:cs/>
+                <w:lang w:bidi="ta-IN"/>
+              </w:rPr>
+              <w:t>ந்</w:t>
+            </w:r>
+            <w:r>
+              <w:rPr>
+                <w:rFonts w:ascii="Latha" w:hAnsi="Latha" w:cs="Latha"/>
+                <w:sz w:val="28"/>
+                <w:szCs w:val="28"/>
+                <w:highlight w:val="green"/>
+                <w:cs/>
+                <w:lang w:bidi="ta-IN"/>
+              </w:rPr>
+              <w:t>த்</w:t>
+            </w:r>
+            <w:r>
+              <w:rPr>
+                <w:rFonts w:ascii="Latha" w:hAnsi="Latha" w:cs="Latha"/>
+                <w:b/>
+                <w:bCs/>
+                <w:position w:val="-12"/>
+                <w:sz w:val="28"/>
+                <w:szCs w:val="28"/>
+                <w:highlight w:val="green"/>
+                <w:cs/>
+                <w:lang w:bidi="ta-IN"/>
+              </w:rPr>
+              <w:t>3</w:t>
+            </w:r>
+            <w:r>
+              <w:rPr>
+                <w:rFonts w:ascii="Latha" w:hAnsi="Latha" w:cs="Latha"/>
+                <w:sz w:val="28"/>
+                <w:szCs w:val="28"/>
+                <w:highlight w:val="green"/>
+                <w:cs/>
+                <w:lang w:bidi="ta-IN"/>
+              </w:rPr>
+              <w:t>ர</w:t>
+            </w:r>
+            <w:r>
+              <w:rPr>
+                <w:rFonts w:ascii="BRH Tamil Tab Extra" w:hAnsi="BRH Tamil Tab Extra" w:cs="Latha"/>
+                <w:b/>
+                <w:sz w:val="32"/>
+                <w:szCs w:val="28"/>
+                <w:highlight w:val="yellow"/>
+                <w:lang w:bidi="ta-IN"/>
+              </w:rPr>
+              <w:t>…</w:t>
+            </w:r>
+            <w:r>
+              <w:rPr>
+                <w:rFonts w:ascii="Latha" w:hAnsi="Latha" w:cs="Latha"/>
+                <w:sz w:val="28"/>
+                <w:szCs w:val="28"/>
+                <w:cs/>
+                <w:lang w:bidi="ta-IN"/>
+              </w:rPr>
+              <w:t>வா</w:t>
+            </w:r>
+            <w:r>
+              <w:rPr>
+                <w:rFonts w:ascii="BRH Tamil Tab Extra" w:hAnsi="BRH Tamil Tab Extra" w:cs="Latha"/>
+                <w:b/>
+                <w:sz w:val="32"/>
+                <w:szCs w:val="28"/>
+                <w:lang w:bidi="ta-IN"/>
+              </w:rPr>
+              <w:t>…</w:t>
+            </w:r>
+            <w:r>
+              <w:rPr>
+                <w:rFonts w:ascii="Latha" w:hAnsi="Latha" w:cs="Latha"/>
+                <w:sz w:val="28"/>
+                <w:szCs w:val="28"/>
+                <w:cs/>
+                <w:lang w:bidi="ta-IN"/>
+              </w:rPr>
+              <w:t>ய</w:t>
+            </w:r>
+            <w:r>
+              <w:rPr>
+                <w:rFonts w:ascii="BRH Tamil Tab Extra" w:hAnsi="BRH Tamil Tab Extra" w:cs="Latha"/>
+                <w:b/>
+                <w:sz w:val="32"/>
+                <w:szCs w:val="28"/>
+                <w:lang w:bidi="ta-IN"/>
+              </w:rPr>
+              <w:t>…</w:t>
+            </w:r>
+            <w:r>
+              <w:rPr>
+                <w:rFonts w:ascii="Latha" w:hAnsi="Latha" w:cs="Latha"/>
+                <w:sz w:val="28"/>
+                <w:szCs w:val="28"/>
+                <w:cs/>
+                <w:lang w:bidi="ta-IN"/>
+              </w:rPr>
+              <w:t>வாக்</w:t>
+            </w:r>
+            <w:r>
+              <w:rPr>
+                <w:rFonts w:ascii="Latha" w:hAnsi="Latha" w:cs="Latha"/>
+                <w:b/>
+                <w:bCs/>
+                <w:position w:val="-12"/>
+                <w:sz w:val="28"/>
+                <w:szCs w:val="28"/>
+                <w:cs/>
+                <w:lang w:bidi="ta-IN"/>
+              </w:rPr>
+              <w:t>3</w:t>
+            </w:r>
+            <w:r>
+              <w:rPr>
+                <w:rFonts w:ascii="Latha" w:hAnsi="Latha" w:cs="Latha"/>
+                <w:sz w:val="28"/>
+                <w:szCs w:val="28"/>
+                <w:cs/>
+                <w:lang w:bidi="ta-IN"/>
+              </w:rPr>
+              <w:t>ரா</w:t>
+            </w:r>
+            <w:r>
+              <w:rPr>
+                <w:rFonts w:ascii="BRH Tamil Tab Extra" w:hAnsi="BRH Tamil Tab Extra" w:cs="Latha"/>
+                <w:b/>
+                <w:sz w:val="36"/>
+                <w:szCs w:val="28"/>
+                <w:lang w:bidi="ta-IN"/>
+              </w:rPr>
+              <w:t>‡</w:t>
+            </w:r>
+            <w:r>
+              <w:rPr>
+                <w:rFonts w:ascii="Latha" w:hAnsi="Latha" w:cs="Latha"/>
+                <w:sz w:val="28"/>
+                <w:szCs w:val="28"/>
+                <w:cs/>
+                <w:lang w:bidi="ta-IN"/>
+              </w:rPr>
+              <w:t>ன்</w:t>
+            </w:r>
+            <w:r>
+              <w:rPr>
+                <w:rFonts w:ascii="Latha" w:hAnsi="Latha" w:cs="Latha"/>
+                <w:sz w:val="28"/>
+                <w:szCs w:val="28"/>
+                <w:lang w:bidi="ta-IN"/>
+              </w:rPr>
+              <w:t xml:space="preserve"> </w:t>
+            </w:r>
+            <w:r>
+              <w:rPr>
+                <w:rFonts w:ascii="Latha" w:hAnsi="Latha" w:cs="Latha"/>
+                <w:sz w:val="28"/>
+                <w:szCs w:val="28"/>
+                <w:cs/>
+                <w:lang w:bidi="ta-IN"/>
+              </w:rPr>
+              <w:t>க்</w:t>
+            </w:r>
+            <w:r>
+              <w:rPr>
+                <w:rFonts w:ascii="Latha" w:hAnsi="Latha" w:cs="Latha"/>
+                <w:b/>
+                <w:bCs/>
+                <w:position w:val="-12"/>
+                <w:sz w:val="28"/>
+                <w:szCs w:val="28"/>
+                <w:cs/>
+                <w:lang w:bidi="ta-IN"/>
+              </w:rPr>
+              <w:t>3</w:t>
+            </w:r>
+            <w:r>
+              <w:rPr>
+                <w:rFonts w:ascii="Latha" w:hAnsi="Latha" w:cs="Latha"/>
+                <w:b/>
+                <w:bCs/>
+                <w:i/>
+                <w:iCs/>
+                <w:sz w:val="28"/>
+                <w:szCs w:val="28"/>
+                <w:cs/>
+                <w:lang w:bidi="ta-IN"/>
+              </w:rPr>
+              <w:t>ரு</w:t>
+            </w:r>
+            <w:r>
+              <w:rPr>
+                <w:rFonts w:ascii="Latha" w:hAnsi="Latha" w:cs="Latha"/>
+                <w:sz w:val="28"/>
+                <w:szCs w:val="28"/>
+                <w:cs/>
+                <w:lang w:bidi="ta-IN"/>
+              </w:rPr>
+              <w:t>ஹ்ணீயாத்</w:t>
+            </w:r>
+            <w:r>
+              <w:rPr>
+                <w:rFonts w:ascii="Latha" w:hAnsi="Latha" w:cs="Latha"/>
+                <w:sz w:val="28"/>
+                <w:szCs w:val="28"/>
+                <w:lang w:bidi="ta-IN"/>
+              </w:rPr>
+              <w:t xml:space="preserve"> |</w:t>
+            </w:r>
+          </w:p>
+          <w:p>
+            <w:pPr>
+              <w:spacing w:before="0" w:line="240" w:lineRule="auto"/>
+              <w:ind w:right="-18"/>
+              <w:rPr>
+                <w:rFonts w:ascii="Latha" w:hAnsi="Latha" w:cs="Latha"/>
+                <w:sz w:val="28"/>
+                <w:szCs w:val="28"/>
+                <w:cs/>
+                <w:lang w:bidi="ta-IN"/>
+              </w:rPr>
+            </w:pPr>
+            <w:r>
+              <w:rPr>
+                <w:rFonts w:ascii="Latha" w:hAnsi="Latha" w:cs="Latha"/>
+                <w:sz w:val="28"/>
+                <w:szCs w:val="28"/>
+                <w:cs/>
+                <w:lang w:bidi="ta-IN"/>
+              </w:rPr>
+              <w:t>ஐ</w:t>
+            </w:r>
+            <w:r>
+              <w:rPr>
+                <w:rFonts w:ascii="BRH Tamil Tab Extra" w:hAnsi="BRH Tamil Tab Extra" w:cs="Latha"/>
+                <w:b/>
+                <w:sz w:val="32"/>
+                <w:szCs w:val="28"/>
+                <w:lang w:bidi="ta-IN"/>
+              </w:rPr>
+              <w:t>…</w:t>
+            </w:r>
+            <w:r>
+              <w:rPr>
+                <w:rFonts w:ascii="Latha" w:hAnsi="Latha" w:cs="Latha"/>
+                <w:sz w:val="28"/>
+                <w:szCs w:val="28"/>
+                <w:cs/>
+                <w:lang w:bidi="ta-IN"/>
+              </w:rPr>
+              <w:t>ந்</w:t>
+            </w:r>
+            <w:r>
+              <w:rPr>
+                <w:rFonts w:ascii="Latha" w:hAnsi="Latha" w:cs="Latha"/>
+                <w:sz w:val="28"/>
+                <w:szCs w:val="28"/>
+                <w:highlight w:val="green"/>
+                <w:cs/>
+                <w:lang w:bidi="ta-IN"/>
+              </w:rPr>
+              <w:t>த்</w:t>
+            </w:r>
+            <w:r>
+              <w:rPr>
+                <w:rFonts w:ascii="Latha" w:hAnsi="Latha" w:cs="Latha"/>
+                <w:b/>
+                <w:bCs/>
+                <w:position w:val="-12"/>
+                <w:sz w:val="28"/>
+                <w:szCs w:val="28"/>
+                <w:highlight w:val="green"/>
+                <w:cs/>
+                <w:lang w:bidi="ta-IN"/>
+              </w:rPr>
+              <w:t>3</w:t>
+            </w:r>
+            <w:r>
+              <w:rPr>
+                <w:rFonts w:ascii="Latha" w:hAnsi="Latha" w:cs="Latha"/>
+                <w:sz w:val="28"/>
+                <w:szCs w:val="28"/>
+                <w:highlight w:val="green"/>
+                <w:cs/>
+                <w:lang w:bidi="ta-IN"/>
+              </w:rPr>
+              <w:t>ர</w:t>
+            </w:r>
+            <w:r>
+              <w:rPr>
+                <w:rFonts w:ascii="BRH Tamil Tab Extra" w:hAnsi="BRH Tamil Tab Extra" w:cs="Latha"/>
+                <w:b/>
+                <w:sz w:val="32"/>
+                <w:szCs w:val="28"/>
+                <w:highlight w:val="yellow"/>
+                <w:lang w:bidi="ta-IN"/>
+              </w:rPr>
+              <w:t>…</w:t>
+            </w:r>
+            <w:r>
+              <w:rPr>
+                <w:rFonts w:ascii="Latha" w:hAnsi="Latha" w:cs="Latha"/>
+                <w:sz w:val="28"/>
+                <w:szCs w:val="28"/>
+                <w:cs/>
+                <w:lang w:bidi="ta-IN"/>
+              </w:rPr>
+              <w:t>வா</w:t>
+            </w:r>
+            <w:r>
+              <w:rPr>
+                <w:rFonts w:ascii="BRH Tamil Tab Extra" w:hAnsi="BRH Tamil Tab Extra" w:cs="Latha"/>
+                <w:b/>
+                <w:sz w:val="32"/>
+                <w:szCs w:val="28"/>
+                <w:lang w:bidi="ta-IN"/>
+              </w:rPr>
+              <w:t>…</w:t>
+            </w:r>
+            <w:r>
+              <w:rPr>
+                <w:rFonts w:ascii="Latha" w:hAnsi="Latha" w:cs="Latha"/>
+                <w:sz w:val="28"/>
+                <w:szCs w:val="28"/>
+                <w:cs/>
+                <w:lang w:bidi="ta-IN"/>
+              </w:rPr>
+              <w:t>ய</w:t>
+            </w:r>
+            <w:r>
+              <w:rPr>
+                <w:rFonts w:ascii="BRH Tamil Tab Extra" w:hAnsi="BRH Tamil Tab Extra" w:cs="Latha"/>
+                <w:b/>
+                <w:sz w:val="32"/>
+                <w:szCs w:val="28"/>
+                <w:lang w:bidi="ta-IN"/>
+              </w:rPr>
+              <w:t>…</w:t>
+            </w:r>
+            <w:r>
+              <w:rPr>
+                <w:rFonts w:ascii="Latha" w:hAnsi="Latha" w:cs="Latha"/>
+                <w:sz w:val="28"/>
+                <w:szCs w:val="28"/>
+                <w:cs/>
+                <w:lang w:bidi="ta-IN"/>
+              </w:rPr>
+              <w:t>வாக்</w:t>
+            </w:r>
+            <w:r>
+              <w:rPr>
+                <w:rFonts w:ascii="Latha" w:hAnsi="Latha" w:cs="Latha"/>
+                <w:b/>
+                <w:bCs/>
+                <w:position w:val="-12"/>
+                <w:sz w:val="28"/>
+                <w:szCs w:val="28"/>
+                <w:cs/>
+                <w:lang w:bidi="ta-IN"/>
+              </w:rPr>
+              <w:t>3</w:t>
+            </w:r>
+            <w:r>
+              <w:rPr>
+                <w:rFonts w:ascii="Latha" w:hAnsi="Latha" w:cs="Latha"/>
+                <w:sz w:val="28"/>
+                <w:szCs w:val="28"/>
+                <w:cs/>
+                <w:lang w:bidi="ta-IN"/>
+              </w:rPr>
+              <w:t>ரா</w:t>
+            </w:r>
+            <w:r>
+              <w:rPr>
+                <w:rFonts w:ascii="BRH Tamil Tab Extra" w:hAnsi="BRH Tamil Tab Extra" w:cs="Latha"/>
+                <w:b/>
+                <w:sz w:val="32"/>
+                <w:szCs w:val="28"/>
+                <w:lang w:bidi="ta-IN"/>
+              </w:rPr>
+              <w:t>…</w:t>
+            </w:r>
+            <w:r>
+              <w:rPr>
+                <w:rFonts w:ascii="Latha" w:hAnsi="Latha" w:cs="Latha"/>
+                <w:sz w:val="28"/>
+                <w:szCs w:val="28"/>
+                <w:cs/>
+                <w:lang w:bidi="ta-IN"/>
+              </w:rPr>
+              <w:t>னி</w:t>
+            </w:r>
+            <w:r>
+              <w:rPr>
+                <w:rFonts w:ascii="Latha" w:hAnsi="Latha" w:cs="Latha"/>
+                <w:sz w:val="28"/>
+                <w:szCs w:val="28"/>
+                <w:lang w:bidi="ta-IN"/>
+              </w:rPr>
+              <w:t xml:space="preserve">- </w:t>
+            </w:r>
+            <w:r>
+              <w:rPr>
+                <w:rFonts w:ascii="Latha" w:hAnsi="Latha" w:cs="Latha"/>
+                <w:sz w:val="28"/>
+                <w:szCs w:val="28"/>
+                <w:cs/>
+                <w:lang w:bidi="ta-IN"/>
+              </w:rPr>
+              <w:t>த்யை</w:t>
+            </w:r>
+            <w:r>
+              <w:rPr>
+                <w:rFonts w:ascii="BRH Tamil Tab Extra" w:hAnsi="BRH Tamil Tab Extra" w:cs="Latha"/>
+                <w:b/>
+                <w:sz w:val="36"/>
+                <w:szCs w:val="28"/>
+                <w:lang w:bidi="ta-IN"/>
+              </w:rPr>
+              <w:t>‡</w:t>
+            </w:r>
+            <w:r>
+              <w:rPr>
+                <w:rFonts w:ascii="Latha" w:hAnsi="Latha" w:cs="Latha"/>
+                <w:sz w:val="28"/>
+                <w:szCs w:val="28"/>
+                <w:cs/>
+                <w:lang w:bidi="ta-IN"/>
+              </w:rPr>
+              <w:t>ந்த்</w:t>
+            </w:r>
+            <w:r>
+              <w:rPr>
+                <w:rFonts w:ascii="Latha" w:hAnsi="Latha" w:cs="Latha"/>
+                <w:b/>
+                <w:bCs/>
+                <w:position w:val="-12"/>
+                <w:sz w:val="28"/>
+                <w:szCs w:val="28"/>
+                <w:cs/>
+                <w:lang w:bidi="ta-IN"/>
+              </w:rPr>
+              <w:t>3</w:t>
+            </w:r>
+            <w:r>
+              <w:rPr>
+                <w:rFonts w:ascii="Latha" w:hAnsi="Latha" w:cs="Latha"/>
+                <w:sz w:val="28"/>
+                <w:szCs w:val="28"/>
+                <w:cs/>
+                <w:lang w:bidi="ta-IN"/>
+              </w:rPr>
+              <w:t>ரவாய</w:t>
+            </w:r>
+            <w:r>
+              <w:rPr>
+                <w:rFonts w:ascii="BRH Tamil Tab Extra" w:hAnsi="BRH Tamil Tab Extra" w:cs="Latha"/>
+                <w:b/>
+                <w:sz w:val="32"/>
+                <w:szCs w:val="28"/>
+                <w:lang w:bidi="ta-IN"/>
+              </w:rPr>
+              <w:t>…</w:t>
+            </w:r>
+            <w:r>
+              <w:rPr>
+                <w:rFonts w:ascii="Latha" w:hAnsi="Latha" w:cs="Latha"/>
+                <w:sz w:val="28"/>
+                <w:szCs w:val="28"/>
+                <w:cs/>
+                <w:lang w:bidi="ta-IN"/>
+              </w:rPr>
+              <w:t>வ</w:t>
+            </w:r>
+            <w:r>
+              <w:rPr>
+                <w:rFonts w:ascii="Latha" w:hAnsi="Latha" w:cs="Latha"/>
+                <w:sz w:val="28"/>
+                <w:szCs w:val="28"/>
+                <w:lang w:bidi="ta-IN"/>
+              </w:rPr>
+              <w:t xml:space="preserve"> - </w:t>
+            </w:r>
+            <w:r>
+              <w:rPr>
+                <w:rFonts w:ascii="Latha" w:hAnsi="Latha" w:cs="Latha"/>
+                <w:sz w:val="28"/>
+                <w:szCs w:val="28"/>
+                <w:cs/>
+                <w:lang w:bidi="ta-IN"/>
+              </w:rPr>
+              <w:t>அ</w:t>
+            </w:r>
+            <w:r>
+              <w:rPr>
+                <w:rFonts w:ascii="BRH Tamil Tab Extra" w:hAnsi="BRH Tamil Tab Extra" w:cs="Latha"/>
+                <w:b/>
+                <w:sz w:val="32"/>
+                <w:szCs w:val="28"/>
+                <w:lang w:bidi="ta-IN"/>
+              </w:rPr>
+              <w:t>…</w:t>
+            </w:r>
+            <w:r>
+              <w:rPr>
+                <w:rFonts w:ascii="Latha" w:hAnsi="Latha" w:cs="Latha"/>
+                <w:sz w:val="28"/>
+                <w:szCs w:val="28"/>
+                <w:cs/>
+                <w:lang w:bidi="ta-IN"/>
+              </w:rPr>
+              <w:t>க்</w:t>
+            </w:r>
+            <w:r>
+              <w:rPr>
+                <w:rFonts w:ascii="Latha" w:hAnsi="Latha" w:cs="Latha"/>
+                <w:b/>
+                <w:bCs/>
+                <w:position w:val="-12"/>
+                <w:sz w:val="28"/>
+                <w:szCs w:val="28"/>
+                <w:cs/>
+                <w:lang w:bidi="ta-IN"/>
+              </w:rPr>
+              <w:t>3</w:t>
+            </w:r>
+            <w:r>
+              <w:rPr>
+                <w:rFonts w:ascii="Latha" w:hAnsi="Latha" w:cs="Latha"/>
+                <w:sz w:val="28"/>
+                <w:szCs w:val="28"/>
+                <w:cs/>
+                <w:lang w:bidi="ta-IN"/>
+              </w:rPr>
+              <w:t>ரா</w:t>
+            </w:r>
+            <w:r>
+              <w:rPr>
+                <w:rFonts w:ascii="BRH Tamil Tab Extra" w:hAnsi="BRH Tamil Tab Extra" w:cs="Latha"/>
+                <w:b/>
+                <w:sz w:val="32"/>
+                <w:szCs w:val="28"/>
+                <w:lang w:bidi="ta-IN"/>
+              </w:rPr>
+              <w:t>…</w:t>
+            </w:r>
+            <w:r>
+              <w:rPr>
+                <w:rFonts w:ascii="Latha" w:hAnsi="Latha" w:cs="Latha"/>
+                <w:sz w:val="28"/>
+                <w:szCs w:val="28"/>
+                <w:cs/>
+                <w:lang w:bidi="ta-IN"/>
+              </w:rPr>
+              <w:t>ன்</w:t>
+            </w:r>
+            <w:r>
+              <w:rPr>
+                <w:rFonts w:ascii="BRH Tamil Tab Extra" w:hAnsi="BRH Tamil Tab Extra" w:cs="Latha"/>
+                <w:b/>
+                <w:sz w:val="32"/>
+                <w:szCs w:val="28"/>
+                <w:lang w:bidi="ta-IN"/>
+              </w:rPr>
+              <w:t>…</w:t>
             </w:r>
           </w:p>
         </w:tc>
@@ -1055,30 +3040,6 @@
         </w:tc>
       </w:tr>
     </w:tbl>
-    <w:p>
-      <w:pPr>
-        <w:jc w:val="center"/>
-        <w:rPr>
-          <w:b/>
-          <w:bCs/>
-          <w:sz w:val="32"/>
-          <w:szCs w:val="32"/>
-          <w:u w:val="single"/>
-        </w:rPr>
-      </w:pPr>
-    </w:p>
-    <w:p>
-      <w:pPr>
-        <w:jc w:val="center"/>
-        <w:rPr>
-          <w:b/>
-          <w:bCs/>
-          <w:sz w:val="32"/>
-          <w:szCs w:val="32"/>
-          <w:u w:val="single"/>
-        </w:rPr>
-      </w:pPr>
-    </w:p>
     <w:p>
       <w:pPr>
         <w:jc w:val="center"/>
@@ -1122,6 +3083,7 @@
           <w:szCs w:val="32"/>
           <w:u w:val="single"/>
         </w:rPr>
+        <w:lastRenderedPageBreak/>
         <w:t xml:space="preserve">TS </w:t>
       </w:r>
       <w:r>
@@ -2033,7 +3995,6 @@
                 <w:sz w:val="28"/>
                 <w:szCs w:val="32"/>
               </w:rPr>
-              <w:lastRenderedPageBreak/>
               <w:t>T.S.</w:t>
             </w:r>
             <w:r>
@@ -3192,6 +5153,7 @@
           <w:szCs w:val="32"/>
           <w:u w:val="single"/>
         </w:rPr>
+        <w:lastRenderedPageBreak/>
         <w:t xml:space="preserve">TS </w:t>
       </w:r>
       <w:r>
@@ -3465,7 +5427,6 @@
                 <w:sz w:val="28"/>
                 <w:szCs w:val="32"/>
               </w:rPr>
-              <w:lastRenderedPageBreak/>
               <w:t>T.S.</w:t>
             </w:r>
             <w:r>
@@ -6787,6 +8748,7 @@
                 <w:sz w:val="28"/>
                 <w:szCs w:val="32"/>
               </w:rPr>
+              <w:lastRenderedPageBreak/>
               <w:t>T.S.7.2.6.2 – Kramam</w:t>
             </w:r>
           </w:p>
@@ -7376,7 +9338,6 @@
                 <w:sz w:val="28"/>
                 <w:szCs w:val="32"/>
               </w:rPr>
-              <w:lastRenderedPageBreak/>
               <w:t>T.S.7.2.6.2 – Kramam</w:t>
             </w:r>
           </w:p>
@@ -10519,6 +12480,7 @@
                 <w:sz w:val="28"/>
                 <w:szCs w:val="32"/>
               </w:rPr>
+              <w:lastRenderedPageBreak/>
               <w:t>T.S.7.2.8.7 – Kramam</w:t>
             </w:r>
           </w:p>
@@ -11089,7 +13051,6 @@
                 <w:sz w:val="28"/>
                 <w:szCs w:val="32"/>
               </w:rPr>
-              <w:lastRenderedPageBreak/>
               <w:t>T.S.7.2.8.7 – Kramam</w:t>
             </w:r>
           </w:p>
@@ -14882,6 +16843,7 @@
                 <w:sz w:val="28"/>
                 <w:szCs w:val="32"/>
               </w:rPr>
+              <w:lastRenderedPageBreak/>
               <w:t>T.S.7.2.13.1 – Kramam</w:t>
             </w:r>
           </w:p>
@@ -15680,7 +17642,6 @@
                 <w:sz w:val="28"/>
                 <w:szCs w:val="32"/>
               </w:rPr>
-              <w:lastRenderedPageBreak/>
               <w:t>T.S.7.2.15.1 – Kramam</w:t>
             </w:r>
           </w:p>
@@ -18138,7 +20099,7 @@
   <w:style w:type="paragraph" w:default="1" w:styleId="Normal">
     <w:name w:val="Normal"/>
     <w:qFormat/>
-    <w:rsid w:val="00076C05"/>
+    <w:rsid w:val="002B58EF"/>
     <w:pPr>
       <w:spacing w:before="120" w:line="276" w:lineRule="auto"/>
     </w:pPr>

</xml_diff>

<commit_message>
TS 7.1 7.2 Tamil Kramam Jatai compare
</commit_message>
<xml_diff>
--- a/TS-Kramam/TS-7.2/TS 7.2 Tamil Krama Paatam Corrections.docx
+++ b/TS-Kramam/TS-7.2/TS 7.2 Tamil Krama Paatam Corrections.docx
@@ -81,7 +81,18 @@
           <w:szCs w:val="32"/>
           <w:u w:val="single"/>
         </w:rPr>
-        <w:t xml:space="preserve">Observed till </w:t>
+        <w:t xml:space="preserve">Observed </w:t>
+      </w:r>
+      <w:proofErr w:type="gramStart"/>
+      <w:r>
+        <w:rPr>
+          <w:b/>
+          <w:bCs/>
+          <w:sz w:val="32"/>
+          <w:szCs w:val="32"/>
+          <w:u w:val="single"/>
+        </w:rPr>
+        <w:t xml:space="preserve">till </w:t>
       </w:r>
       <w:r>
         <w:rPr>
@@ -94,6 +105,7 @@
         </w:rPr>
         <w:t>????</w:t>
       </w:r>
+      <w:proofErr w:type="gramEnd"/>
     </w:p>
     <w:p>
       <w:pPr>
@@ -976,7 +988,25 @@
                 <w:sz w:val="28"/>
                 <w:szCs w:val="32"/>
               </w:rPr>
-              <w:t>Panchaati No</w:t>
+              <w:t>Pancha</w:t>
+            </w:r>
+            <w:r>
+              <w:rPr>
+                <w:rFonts w:cs="Arial"/>
+                <w:b/>
+                <w:sz w:val="28"/>
+                <w:szCs w:val="32"/>
+              </w:rPr>
+              <w:t>a</w:t>
+            </w:r>
+            <w:r>
+              <w:rPr>
+                <w:rFonts w:cs="Arial"/>
+                <w:b/>
+                <w:sz w:val="28"/>
+                <w:szCs w:val="32"/>
+              </w:rPr>
+              <w:t>ti No</w:t>
             </w:r>
             <w:r>
               <w:rPr>
@@ -2207,6 +2237,574 @@
                 <w:lang w:bidi="ta-IN"/>
               </w:rPr>
               <w:t>…</w:t>
+            </w:r>
+          </w:p>
+        </w:tc>
+      </w:tr>
+      <w:tr>
+        <w:tc>
+          <w:tcPr>
+            <w:tcW w:w="3877" w:type="dxa"/>
+          </w:tcPr>
+          <w:p>
+            <w:pPr>
+              <w:widowControl w:val="0"/>
+              <w:tabs>
+                <w:tab w:val="left" w:pos="993"/>
+              </w:tabs>
+              <w:autoSpaceDE w:val="0"/>
+              <w:autoSpaceDN w:val="0"/>
+              <w:adjustRightInd w:val="0"/>
+              <w:spacing w:before="0" w:line="240" w:lineRule="auto"/>
+              <w:ind w:right="297"/>
+              <w:rPr>
+                <w:rFonts w:cs="Arial"/>
+                <w:b/>
+                <w:sz w:val="28"/>
+                <w:szCs w:val="32"/>
+              </w:rPr>
+            </w:pPr>
+            <w:r>
+              <w:rPr>
+                <w:rFonts w:cs="Arial"/>
+                <w:b/>
+                <w:sz w:val="28"/>
+                <w:szCs w:val="32"/>
+              </w:rPr>
+              <w:t>T.S.</w:t>
+            </w:r>
+            <w:r>
+              <w:rPr>
+                <w:rFonts w:cs="Arial"/>
+                <w:b/>
+                <w:sz w:val="28"/>
+                <w:szCs w:val="32"/>
+              </w:rPr>
+              <w:t>7.2.</w:t>
+            </w:r>
+            <w:r>
+              <w:rPr>
+                <w:rFonts w:cs="Arial"/>
+                <w:b/>
+                <w:sz w:val="28"/>
+                <w:szCs w:val="32"/>
+              </w:rPr>
+              <w:t>8</w:t>
+            </w:r>
+            <w:r>
+              <w:rPr>
+                <w:rFonts w:cs="Arial"/>
+                <w:b/>
+                <w:sz w:val="28"/>
+                <w:szCs w:val="32"/>
+              </w:rPr>
+              <w:t>.</w:t>
+            </w:r>
+            <w:r>
+              <w:rPr>
+                <w:rFonts w:cs="Arial"/>
+                <w:b/>
+                <w:sz w:val="28"/>
+                <w:szCs w:val="32"/>
+              </w:rPr>
+              <w:t>7</w:t>
+            </w:r>
+            <w:r>
+              <w:rPr>
+                <w:rFonts w:cs="Arial"/>
+                <w:b/>
+                <w:sz w:val="28"/>
+                <w:szCs w:val="32"/>
+              </w:rPr>
+              <w:t xml:space="preserve"> – Kramam</w:t>
+            </w:r>
+          </w:p>
+          <w:p>
+            <w:pPr>
+              <w:widowControl w:val="0"/>
+              <w:tabs>
+                <w:tab w:val="left" w:pos="993"/>
+              </w:tabs>
+              <w:autoSpaceDE w:val="0"/>
+              <w:autoSpaceDN w:val="0"/>
+              <w:adjustRightInd w:val="0"/>
+              <w:spacing w:before="0" w:line="240" w:lineRule="auto"/>
+              <w:ind w:right="297"/>
+              <w:rPr>
+                <w:rFonts w:cs="Arial"/>
+                <w:b/>
+                <w:sz w:val="28"/>
+                <w:szCs w:val="32"/>
+              </w:rPr>
+            </w:pPr>
+            <w:r>
+              <w:rPr>
+                <w:rFonts w:cs="Arial"/>
+                <w:b/>
+                <w:sz w:val="28"/>
+                <w:szCs w:val="32"/>
+              </w:rPr>
+              <w:t xml:space="preserve">Krama Vaakyam No.– </w:t>
+            </w:r>
+            <w:r>
+              <w:rPr>
+                <w:rFonts w:cs="Arial"/>
+                <w:b/>
+                <w:sz w:val="28"/>
+                <w:szCs w:val="32"/>
+              </w:rPr>
+              <w:t>57</w:t>
+            </w:r>
+          </w:p>
+          <w:p>
+            <w:pPr>
+              <w:widowControl w:val="0"/>
+              <w:tabs>
+                <w:tab w:val="left" w:pos="993"/>
+              </w:tabs>
+              <w:autoSpaceDE w:val="0"/>
+              <w:autoSpaceDN w:val="0"/>
+              <w:adjustRightInd w:val="0"/>
+              <w:spacing w:before="0" w:line="240" w:lineRule="auto"/>
+              <w:ind w:right="297"/>
+              <w:rPr>
+                <w:rFonts w:cs="Arial"/>
+                <w:b/>
+                <w:sz w:val="28"/>
+                <w:szCs w:val="32"/>
+              </w:rPr>
+            </w:pPr>
+            <w:r>
+              <w:rPr>
+                <w:rFonts w:cs="Arial"/>
+                <w:b/>
+                <w:sz w:val="28"/>
+                <w:szCs w:val="32"/>
+              </w:rPr>
+              <w:t>Panchaati No</w:t>
+            </w:r>
+            <w:r>
+              <w:rPr>
+                <w:rFonts w:cs="Arial"/>
+                <w:b/>
+                <w:szCs w:val="32"/>
+              </w:rPr>
+              <w:t>. -</w:t>
+            </w:r>
+            <w:r>
+              <w:rPr>
+                <w:rFonts w:cs="Arial"/>
+                <w:b/>
+                <w:sz w:val="28"/>
+                <w:szCs w:val="28"/>
+              </w:rPr>
+              <w:t xml:space="preserve"> </w:t>
+            </w:r>
+            <w:r>
+              <w:rPr>
+                <w:rFonts w:cs="Arial"/>
+                <w:b/>
+                <w:sz w:val="28"/>
+                <w:szCs w:val="28"/>
+              </w:rPr>
+              <w:t>33</w:t>
+            </w:r>
+          </w:p>
+        </w:tc>
+        <w:tc>
+          <w:tcPr>
+            <w:tcW w:w="4848" w:type="dxa"/>
+          </w:tcPr>
+          <w:p>
+            <w:pPr>
+              <w:spacing w:before="0" w:line="240" w:lineRule="auto"/>
+              <w:rPr>
+                <w:rFonts w:ascii="Latha" w:hAnsi="Latha" w:cs="Latha"/>
+                <w:sz w:val="28"/>
+                <w:szCs w:val="28"/>
+                <w:highlight w:val="yellow"/>
+                <w:cs/>
+                <w:lang w:bidi="ta-IN"/>
+              </w:rPr>
+            </w:pPr>
+            <w:r>
+              <w:rPr>
+                <w:rFonts w:ascii="Latha" w:hAnsi="Latha" w:cs="Latha"/>
+                <w:sz w:val="28"/>
+                <w:szCs w:val="28"/>
+                <w:cs/>
+                <w:lang w:bidi="ta-IN"/>
+              </w:rPr>
+              <w:t>இ</w:t>
+            </w:r>
+            <w:r>
+              <w:rPr>
+                <w:rFonts w:ascii="BRH Tamil Tab Extra" w:hAnsi="BRH Tamil Tab Extra" w:cs="Latha"/>
+                <w:b/>
+                <w:sz w:val="32"/>
+                <w:szCs w:val="28"/>
+                <w:lang w:bidi="ta-IN"/>
+              </w:rPr>
+              <w:t>…</w:t>
+            </w:r>
+            <w:r>
+              <w:rPr>
+                <w:rFonts w:ascii="Latha" w:hAnsi="Latha" w:cs="Latha"/>
+                <w:sz w:val="28"/>
+                <w:szCs w:val="28"/>
+                <w:cs/>
+                <w:lang w:bidi="ta-IN"/>
+              </w:rPr>
+              <w:t>த</w:t>
+            </w:r>
+            <w:r>
+              <w:rPr>
+                <w:rFonts w:ascii="Latha" w:hAnsi="Latha" w:cs="Latha"/>
+                <w:b/>
+                <w:bCs/>
+                <w:position w:val="-12"/>
+                <w:sz w:val="28"/>
+                <w:szCs w:val="28"/>
+                <w:cs/>
+                <w:lang w:bidi="ta-IN"/>
+              </w:rPr>
+              <w:t>3</w:t>
+            </w:r>
+            <w:r>
+              <w:rPr>
+                <w:rFonts w:ascii="Latha" w:hAnsi="Latha" w:cs="Latha"/>
+                <w:sz w:val="28"/>
+                <w:szCs w:val="28"/>
+                <w:cs/>
+                <w:lang w:bidi="ta-IN"/>
+              </w:rPr>
+              <w:t>ம</w:t>
+            </w:r>
+            <w:r>
+              <w:rPr>
+                <w:rFonts w:ascii="BRH Tamil Tab Extra" w:hAnsi="BRH Tamil Tab Extra" w:cs="Latha"/>
+                <w:b/>
+                <w:sz w:val="32"/>
+                <w:szCs w:val="28"/>
+                <w:lang w:bidi="ta-IN"/>
+              </w:rPr>
+              <w:t>…</w:t>
+            </w:r>
+            <w:r>
+              <w:rPr>
+                <w:rFonts w:ascii="Latha" w:hAnsi="Latha" w:cs="Latha"/>
+                <w:sz w:val="28"/>
+                <w:szCs w:val="28"/>
+                <w:cs/>
+                <w:lang w:bidi="ta-IN"/>
+              </w:rPr>
+              <w:t>ன்ய</w:t>
+            </w:r>
+            <w:r>
+              <w:rPr>
+                <w:rFonts w:ascii="Latha" w:hAnsi="Latha" w:cs="Latha"/>
+                <w:b/>
+                <w:bCs/>
+                <w:sz w:val="32"/>
+                <w:szCs w:val="32"/>
+                <w:cs/>
+                <w:lang w:bidi="ta-IN"/>
+              </w:rPr>
+              <w:t>:</w:t>
+            </w:r>
+            <w:r>
+              <w:rPr>
+                <w:rFonts w:ascii="Latha" w:hAnsi="Latha" w:cs="Latha"/>
+                <w:sz w:val="28"/>
+                <w:szCs w:val="28"/>
+                <w:lang w:bidi="ta-IN"/>
+              </w:rPr>
+              <w:t xml:space="preserve"> | </w:t>
+            </w:r>
+            <w:r>
+              <w:rPr>
+                <w:rFonts w:ascii="Latha" w:hAnsi="Latha" w:cs="Latha"/>
+                <w:sz w:val="28"/>
+                <w:szCs w:val="28"/>
+                <w:cs/>
+                <w:lang w:bidi="ta-IN"/>
+              </w:rPr>
+              <w:t>அ</w:t>
+            </w:r>
+            <w:r>
+              <w:rPr>
+                <w:rFonts w:ascii="BRH Tamil Tab Extra" w:hAnsi="BRH Tamil Tab Extra" w:cs="Latha"/>
+                <w:b/>
+                <w:sz w:val="32"/>
+                <w:szCs w:val="28"/>
+                <w:lang w:bidi="ta-IN"/>
+              </w:rPr>
+              <w:t>…</w:t>
+            </w:r>
+            <w:r>
+              <w:rPr>
+                <w:rFonts w:ascii="Latha" w:hAnsi="Latha" w:cs="Latha"/>
+                <w:sz w:val="28"/>
+                <w:szCs w:val="28"/>
+                <w:cs/>
+                <w:lang w:bidi="ta-IN"/>
+              </w:rPr>
+              <w:t>ன்</w:t>
+            </w:r>
+            <w:r>
+              <w:rPr>
+                <w:rFonts w:ascii="Latha" w:hAnsi="Latha" w:cs="Latha"/>
+                <w:sz w:val="28"/>
+                <w:szCs w:val="28"/>
+                <w:highlight w:val="yellow"/>
+                <w:cs/>
+                <w:lang w:bidi="ta-IN"/>
+              </w:rPr>
+              <w:t>யோ</w:t>
+            </w:r>
+            <w:r>
+              <w:rPr>
+                <w:rFonts w:ascii="BRH Tamil Tab Extra" w:hAnsi="BRH Tamil Tab Extra" w:cs="Latha"/>
+                <w:b/>
+                <w:sz w:val="36"/>
+                <w:szCs w:val="28"/>
+                <w:highlight w:val="yellow"/>
+                <w:lang w:bidi="ta-IN"/>
+              </w:rPr>
+              <w:t>‡</w:t>
+            </w:r>
+            <w:r>
+              <w:rPr>
+                <w:rFonts w:ascii="Latha" w:hAnsi="Latha" w:cs="Latha"/>
+                <w:sz w:val="28"/>
+                <w:szCs w:val="28"/>
+                <w:highlight w:val="yellow"/>
+                <w:cs/>
+                <w:lang w:bidi="ta-IN"/>
+              </w:rPr>
+              <w:t>ன்</w:t>
+            </w:r>
+            <w:r>
+              <w:rPr>
+                <w:rFonts w:ascii="Latha" w:hAnsi="Latha" w:cs="Latha"/>
+                <w:sz w:val="28"/>
+                <w:szCs w:val="28"/>
+                <w:cs/>
+                <w:lang w:bidi="ta-IN"/>
+              </w:rPr>
+              <w:t>யஸ்மை</w:t>
+            </w:r>
+            <w:r>
+              <w:rPr>
+                <w:rFonts w:ascii="BRH Tamil Tab Extra" w:hAnsi="BRH Tamil Tab Extra" w:cs="Latha"/>
+                <w:b/>
+                <w:sz w:val="36"/>
+                <w:szCs w:val="28"/>
+                <w:lang w:bidi="ta-IN"/>
+              </w:rPr>
+              <w:t>‡</w:t>
+            </w:r>
+            <w:r>
+              <w:rPr>
+                <w:rFonts w:ascii="Latha" w:hAnsi="Latha" w:cs="Latha"/>
+                <w:sz w:val="28"/>
+                <w:szCs w:val="28"/>
+                <w:lang w:bidi="ta-IN"/>
+              </w:rPr>
+              <w:t xml:space="preserve"> ( ) |</w:t>
+            </w:r>
+          </w:p>
+        </w:tc>
+        <w:tc>
+          <w:tcPr>
+            <w:tcW w:w="5220" w:type="dxa"/>
+          </w:tcPr>
+          <w:p>
+            <w:pPr>
+              <w:spacing w:before="0" w:line="240" w:lineRule="auto"/>
+              <w:rPr>
+                <w:rFonts w:ascii="Latha" w:hAnsi="Latha" w:cs="Latha"/>
+                <w:sz w:val="28"/>
+                <w:szCs w:val="28"/>
+                <w:cs/>
+                <w:lang w:bidi="ta-IN"/>
+              </w:rPr>
+            </w:pPr>
+            <w:r>
+              <w:rPr>
+                <w:rFonts w:ascii="Latha" w:hAnsi="Latha" w:cs="Latha"/>
+                <w:sz w:val="28"/>
+                <w:szCs w:val="28"/>
+                <w:cs/>
+                <w:lang w:bidi="ta-IN"/>
+              </w:rPr>
+              <w:t>இ</w:t>
+            </w:r>
+            <w:r>
+              <w:rPr>
+                <w:rFonts w:ascii="BRH Tamil Tab Extra" w:hAnsi="BRH Tamil Tab Extra" w:cs="Latha"/>
+                <w:b/>
+                <w:sz w:val="32"/>
+                <w:szCs w:val="28"/>
+                <w:lang w:bidi="ta-IN"/>
+              </w:rPr>
+              <w:t>…</w:t>
+            </w:r>
+            <w:r>
+              <w:rPr>
+                <w:rFonts w:ascii="Latha" w:hAnsi="Latha" w:cs="Latha"/>
+                <w:sz w:val="28"/>
+                <w:szCs w:val="28"/>
+                <w:cs/>
+                <w:lang w:bidi="ta-IN"/>
+              </w:rPr>
+              <w:t>த</w:t>
+            </w:r>
+            <w:r>
+              <w:rPr>
+                <w:rFonts w:ascii="Latha" w:hAnsi="Latha" w:cs="Latha"/>
+                <w:b/>
+                <w:bCs/>
+                <w:position w:val="-12"/>
+                <w:sz w:val="28"/>
+                <w:szCs w:val="28"/>
+                <w:cs/>
+                <w:lang w:bidi="ta-IN"/>
+              </w:rPr>
+              <w:t>3</w:t>
+            </w:r>
+            <w:r>
+              <w:rPr>
+                <w:rFonts w:ascii="Latha" w:hAnsi="Latha" w:cs="Latha"/>
+                <w:sz w:val="28"/>
+                <w:szCs w:val="28"/>
+                <w:cs/>
+                <w:lang w:bidi="ta-IN"/>
+              </w:rPr>
+              <w:t>ம</w:t>
+            </w:r>
+            <w:r>
+              <w:rPr>
+                <w:rFonts w:ascii="BRH Tamil Tab Extra" w:hAnsi="BRH Tamil Tab Extra" w:cs="Latha"/>
+                <w:b/>
+                <w:sz w:val="32"/>
+                <w:szCs w:val="28"/>
+                <w:lang w:bidi="ta-IN"/>
+              </w:rPr>
+              <w:t>…</w:t>
+            </w:r>
+            <w:r>
+              <w:rPr>
+                <w:rFonts w:ascii="Latha" w:hAnsi="Latha" w:cs="Latha"/>
+                <w:sz w:val="28"/>
+                <w:szCs w:val="28"/>
+                <w:cs/>
+                <w:lang w:bidi="ta-IN"/>
+              </w:rPr>
+              <w:t>ன்ய</w:t>
+            </w:r>
+            <w:r>
+              <w:rPr>
+                <w:rFonts w:ascii="Latha" w:hAnsi="Latha" w:cs="Latha"/>
+                <w:b/>
+                <w:bCs/>
+                <w:sz w:val="32"/>
+                <w:szCs w:val="32"/>
+                <w:cs/>
+                <w:lang w:bidi="ta-IN"/>
+              </w:rPr>
+              <w:t>:</w:t>
+            </w:r>
+            <w:r>
+              <w:rPr>
+                <w:rFonts w:ascii="Latha" w:hAnsi="Latha" w:cs="Latha"/>
+                <w:sz w:val="28"/>
+                <w:szCs w:val="28"/>
+                <w:lang w:bidi="ta-IN"/>
+              </w:rPr>
+              <w:t xml:space="preserve"> | </w:t>
+            </w:r>
+            <w:r>
+              <w:rPr>
+                <w:rFonts w:ascii="Latha" w:hAnsi="Latha" w:cs="Latha"/>
+                <w:sz w:val="28"/>
+                <w:szCs w:val="28"/>
+                <w:cs/>
+                <w:lang w:bidi="ta-IN"/>
+              </w:rPr>
+              <w:t>அ</w:t>
+            </w:r>
+            <w:r>
+              <w:rPr>
+                <w:rFonts w:ascii="BRH Tamil Tab Extra" w:hAnsi="BRH Tamil Tab Extra" w:cs="Latha"/>
+                <w:b/>
+                <w:sz w:val="32"/>
+                <w:szCs w:val="28"/>
+                <w:lang w:bidi="ta-IN"/>
+              </w:rPr>
+              <w:t>…</w:t>
+            </w:r>
+            <w:r>
+              <w:rPr>
+                <w:rFonts w:ascii="Latha" w:hAnsi="Latha" w:cs="Latha"/>
+                <w:sz w:val="28"/>
+                <w:szCs w:val="28"/>
+                <w:cs/>
+                <w:lang w:bidi="ta-IN"/>
+              </w:rPr>
+              <w:t>ன்யோ</w:t>
+            </w:r>
+            <w:r>
+              <w:rPr>
+                <w:rFonts w:ascii="BRH Tamil Tab Extra" w:hAnsi="BRH Tamil Tab Extra" w:cs="Latha"/>
+                <w:b/>
+                <w:sz w:val="36"/>
+                <w:szCs w:val="28"/>
+                <w:lang w:bidi="ta-IN"/>
+              </w:rPr>
+              <w:t>‡</w:t>
+            </w:r>
+            <w:r>
+              <w:rPr>
+                <w:rFonts w:ascii="BRH Devanagari Extra" w:hAnsi="BRH Devanagari Extra" w:cs="Latha"/>
+                <w:b/>
+                <w:bCs/>
+                <w:sz w:val="32"/>
+                <w:szCs w:val="32"/>
+                <w:highlight w:val="green"/>
+                <w:lang w:bidi="ta-IN"/>
+                <w14:ligatures w14:val="standardContextual"/>
+              </w:rPr>
+              <w:t>Å</w:t>
+            </w:r>
+            <w:r>
+              <w:rPr>
+                <w:rFonts w:ascii="Latha" w:hAnsi="Latha" w:cs="Latha"/>
+                <w:sz w:val="28"/>
+                <w:szCs w:val="28"/>
+                <w:cs/>
+                <w:lang w:bidi="ta-IN"/>
+              </w:rPr>
+              <w:t>ன்யஸ்மை</w:t>
+            </w:r>
+            <w:r>
+              <w:rPr>
+                <w:rFonts w:ascii="BRH Tamil Tab Extra" w:hAnsi="BRH Tamil Tab Extra" w:cs="Latha"/>
+                <w:b/>
+                <w:sz w:val="36"/>
+                <w:szCs w:val="28"/>
+                <w:lang w:bidi="ta-IN"/>
+              </w:rPr>
+              <w:t>‡</w:t>
+            </w:r>
+            <w:r>
+              <w:rPr>
+                <w:rFonts w:ascii="Latha" w:hAnsi="Latha" w:cs="Latha"/>
+                <w:sz w:val="28"/>
+                <w:szCs w:val="28"/>
+                <w:lang w:bidi="ta-IN"/>
+              </w:rPr>
+              <w:t xml:space="preserve"> ( ) |</w:t>
             </w:r>
           </w:p>
         </w:tc>
@@ -3083,7 +3681,6 @@
           <w:szCs w:val="32"/>
           <w:u w:val="single"/>
         </w:rPr>
-        <w:lastRenderedPageBreak/>
         <w:t xml:space="preserve">TS </w:t>
       </w:r>
       <w:r>
@@ -5153,7 +5750,6 @@
           <w:szCs w:val="32"/>
           <w:u w:val="single"/>
         </w:rPr>
-        <w:lastRenderedPageBreak/>
         <w:t xml:space="preserve">TS </w:t>
       </w:r>
       <w:r>
@@ -7911,7 +8507,23 @@
                 <w:b/>
                 <w:bCs/>
               </w:rPr>
-              <w:t>“stri”</w:t>
+              <w:t>“</w:t>
+            </w:r>
+            <w:proofErr w:type="spellStart"/>
+            <w:r>
+              <w:rPr>
+                <w:b/>
+                <w:bCs/>
+              </w:rPr>
+              <w:t>stri</w:t>
+            </w:r>
+            <w:proofErr w:type="spellEnd"/>
+            <w:r>
+              <w:rPr>
+                <w:b/>
+                <w:bCs/>
+              </w:rPr>
+              <w:t>”</w:t>
             </w:r>
             <w:r>
               <w:rPr>
@@ -7956,6 +8568,7 @@
                 <w:sz w:val="28"/>
                 <w:szCs w:val="32"/>
               </w:rPr>
+              <w:lastRenderedPageBreak/>
               <w:t>T.S.</w:t>
             </w:r>
             <w:r>
@@ -8748,7 +9361,6 @@
                 <w:sz w:val="28"/>
                 <w:szCs w:val="32"/>
               </w:rPr>
-              <w:lastRenderedPageBreak/>
               <w:t>T.S.7.2.6.2 – Kramam</w:t>
             </w:r>
           </w:p>
@@ -11830,8 +12442,18 @@
                 <w:b/>
                 <w:bCs/>
               </w:rPr>
-              <w:t>(visargam</w:t>
-            </w:r>
+              <w:lastRenderedPageBreak/>
+              <w:t>(</w:t>
+            </w:r>
+            <w:proofErr w:type="spellStart"/>
+            <w:r>
+              <w:rPr>
+                <w:b/>
+                <w:bCs/>
+              </w:rPr>
+              <w:t>visargam</w:t>
+            </w:r>
+            <w:proofErr w:type="spellEnd"/>
             <w:r>
               <w:rPr>
                 <w:rFonts w:ascii="Cambria" w:eastAsia="Times New Roman" w:hAnsi="Cambria" w:cs="BRH Malayalam Extra"/>
@@ -11928,6 +12550,7 @@
                 <w:sz w:val="28"/>
                 <w:szCs w:val="32"/>
               </w:rPr>
+              <w:lastRenderedPageBreak/>
               <w:t>T.S.7.2.8.7 – Kramam</w:t>
             </w:r>
           </w:p>
@@ -12480,7 +13103,6 @@
                 <w:sz w:val="28"/>
                 <w:szCs w:val="32"/>
               </w:rPr>
-              <w:lastRenderedPageBreak/>
               <w:t>T.S.7.2.8.7 – Kramam</w:t>
             </w:r>
           </w:p>
@@ -15503,6 +16125,7 @@
                 <w:sz w:val="28"/>
                 <w:szCs w:val="32"/>
               </w:rPr>
+              <w:lastRenderedPageBreak/>
               <w:t>T.S.7.2.11.1 – Kramam</w:t>
             </w:r>
           </w:p>
@@ -16843,7 +17466,6 @@
                 <w:sz w:val="28"/>
                 <w:szCs w:val="32"/>
               </w:rPr>
-              <w:lastRenderedPageBreak/>
               <w:t>T.S.7.2.13.1 – Kramam</w:t>
             </w:r>
           </w:p>
@@ -18759,7 +19381,16 @@
           <w:bCs/>
           <w:sz w:val="32"/>
         </w:rPr>
-        <w:t>replaced with</w:t>
+        <w:t xml:space="preserve">replaced </w:t>
+      </w:r>
+      <w:proofErr w:type="gramStart"/>
+      <w:r>
+        <w:rPr>
+          <w:b/>
+          <w:bCs/>
+          <w:sz w:val="32"/>
+        </w:rPr>
+        <w:t>with</w:t>
       </w:r>
       <w:r>
         <w:rPr>
@@ -18781,6 +19412,7 @@
         </w:rPr>
         <w:t>"</w:t>
       </w:r>
+      <w:proofErr w:type="gramEnd"/>
       <w:r>
         <w:rPr>
           <w:rFonts w:ascii="Latha" w:hAnsi="Latha" w:cs="Latha"/>
@@ -18957,7 +19589,18 @@
           <w:szCs w:val="32"/>
           <w:u w:val="single"/>
         </w:rPr>
-        <w:t xml:space="preserve">Prior to </w:t>
+        <w:t xml:space="preserve">Prior </w:t>
+      </w:r>
+      <w:proofErr w:type="gramStart"/>
+      <w:r>
+        <w:rPr>
+          <w:b/>
+          <w:bCs/>
+          <w:sz w:val="32"/>
+          <w:szCs w:val="32"/>
+          <w:u w:val="single"/>
+        </w:rPr>
+        <w:t xml:space="preserve">to </w:t>
       </w:r>
       <w:r>
         <w:rPr>
@@ -18977,7 +19620,18 @@
           <w:szCs w:val="32"/>
           <w:u w:val="single"/>
         </w:rPr>
-        <w:t>March 31,2022</w:t>
+        <w:t>March</w:t>
+      </w:r>
+      <w:proofErr w:type="gramEnd"/>
+      <w:r>
+        <w:rPr>
+          <w:b/>
+          <w:bCs/>
+          <w:sz w:val="32"/>
+          <w:szCs w:val="32"/>
+          <w:u w:val="single"/>
+        </w:rPr>
+        <w:t xml:space="preserve"> 31,2022</w:t>
       </w:r>
     </w:p>
     <w:p>
@@ -19038,6 +19692,7 @@
                 <w:sz w:val="32"/>
                 <w:szCs w:val="32"/>
               </w:rPr>
+              <w:lastRenderedPageBreak/>
               <w:t>Section, Paragraph</w:t>
             </w:r>
           </w:p>
@@ -20099,7 +20754,7 @@
   <w:style w:type="paragraph" w:default="1" w:styleId="Normal">
     <w:name w:val="Normal"/>
     <w:qFormat/>
-    <w:rsid w:val="002B58EF"/>
+    <w:rsid w:val="00A303AD"/>
     <w:pPr>
       <w:spacing w:before="120" w:line="276" w:lineRule="auto"/>
     </w:pPr>

</xml_diff>